<commit_message>
Bug Fixes for bugs identified in Black Box Testing (doc/bug_report)
</commit_message>
<xml_diff>
--- a/docs/CS-3009 - Development Methodology.docx
+++ b/docs/CS-3009 - Development Methodology.docx
@@ -396,10 +396,7 @@
         <w:ind w:hanging="360"/>
       </w:pPr>
       <w:r>
-        <w:t>Teacher performance graphs</w:t>
-      </w:r>
-      <w:r>
-        <w:t xml:space="preserve">. </w:t>
+        <w:t xml:space="preserve">Teacher performance graphs. </w:t>
       </w:r>
     </w:p>
     <w:p>
@@ -411,10 +408,7 @@
         <w:ind w:hanging="360"/>
       </w:pPr>
       <w:r>
-        <w:t>HOD dashboard.</w:t>
-      </w:r>
-      <w:r>
-        <w:t xml:space="preserve">  </w:t>
+        <w:t xml:space="preserve">HOD dashboard.  </w:t>
       </w:r>
     </w:p>
     <w:p>
@@ -830,18 +824,7 @@
         <w:ind w:hanging="360"/>
       </w:pPr>
       <w:r>
-        <w:t xml:space="preserve">Write queries to get average scores for department across all performance </w:t>
-      </w:r>
-      <w:proofErr w:type="gramStart"/>
-      <w:r>
-        <w:t>factor</w:t>
-      </w:r>
-      <w:proofErr w:type="gramEnd"/>
-      <w:r>
-        <w:t>.</w:t>
-      </w:r>
-      <w:r>
-        <w:t xml:space="preserve"> </w:t>
+        <w:t xml:space="preserve">Write queries to get average scores for department across all performance factor. </w:t>
       </w:r>
     </w:p>
     <w:p>
@@ -865,13 +848,7 @@
         <w:ind w:hanging="360"/>
       </w:pPr>
       <w:r>
-        <w:t xml:space="preserve">Write queries to get the average scores </w:t>
-      </w:r>
-      <w:r>
-        <w:t>for department across all performance factor</w:t>
-      </w:r>
-      <w:r>
-        <w:t xml:space="preserve"> over several semesters.</w:t>
+        <w:t>Write queries to get the average scores for department across all performance factor over several semesters.</w:t>
       </w:r>
     </w:p>
     <w:p>
@@ -917,10 +894,7 @@
         <w:ind w:hanging="360"/>
       </w:pPr>
       <w:r>
-        <w:t>Add different type of questions (Likert, Slider, Text, Binary)</w:t>
-      </w:r>
-      <w:r>
-        <w:t xml:space="preserve"> </w:t>
+        <w:t xml:space="preserve">Add different type of questions (Likert, Slider, Text, Binary) </w:t>
       </w:r>
     </w:p>
     <w:p>
@@ -1122,9 +1096,1148 @@
           </mc:Fallback>
         </mc:AlternateContent>
       </w:r>
+    </w:p>
+    <w:p>
+      <w:pPr>
+        <w:spacing w:after="16" w:line="259" w:lineRule="auto"/>
+        <w:ind w:left="0" w:right="75" w:firstLine="0"/>
+        <w:jc w:val="right"/>
+      </w:pPr>
+    </w:p>
+    <w:p>
+      <w:pPr>
+        <w:spacing w:after="16" w:line="259" w:lineRule="auto"/>
+        <w:ind w:left="0" w:right="75" w:firstLine="0"/>
+        <w:jc w:val="right"/>
+      </w:pPr>
+    </w:p>
+    <w:p>
+      <w:pPr>
+        <w:spacing w:after="16" w:line="259" w:lineRule="auto"/>
+        <w:ind w:left="0" w:right="75" w:firstLine="0"/>
+      </w:pPr>
+      <w:r>
+        <w:t>Structured Specification:</w:t>
+      </w:r>
+    </w:p>
+    <w:p>
+      <w:pPr>
+        <w:spacing w:after="16" w:line="259" w:lineRule="auto"/>
+        <w:ind w:left="0" w:right="75" w:firstLine="0"/>
+      </w:pPr>
+      <w:r>
+        <w:t>User Story 1: Create Feedback Forms</w:t>
+      </w:r>
+    </w:p>
+    <w:tbl>
+      <w:tblPr>
+        <w:tblStyle w:val="TableGrid0"/>
+        <w:tblW w:w="0" w:type="auto"/>
+        <w:tblLook w:val="04A0" w:firstRow="1" w:lastRow="0" w:firstColumn="1" w:lastColumn="0" w:noHBand="0" w:noVBand="1"/>
+      </w:tblPr>
+      <w:tblGrid>
+        <w:gridCol w:w="1705"/>
+        <w:gridCol w:w="7775"/>
+      </w:tblGrid>
+      <w:tr>
+        <w:tc>
+          <w:tcPr>
+            <w:tcW w:w="1705" w:type="dxa"/>
+          </w:tcPr>
+          <w:p>
+            <w:pPr>
+              <w:spacing w:after="16" w:line="259" w:lineRule="auto"/>
+              <w:ind w:left="0" w:right="75" w:firstLine="0"/>
+            </w:pPr>
+            <w:r>
+              <w:t>Inputs</w:t>
+            </w:r>
+          </w:p>
+        </w:tc>
+        <w:tc>
+          <w:tcPr>
+            <w:tcW w:w="7775" w:type="dxa"/>
+          </w:tcPr>
+          <w:p>
+            <w:pPr>
+              <w:spacing w:after="16" w:line="259" w:lineRule="auto"/>
+              <w:ind w:left="0" w:right="75" w:firstLine="0"/>
+            </w:pPr>
+            <w:r>
+              <w:t>form_name, form_description, questions</w:t>
+            </w:r>
+          </w:p>
+        </w:tc>
+      </w:tr>
+      <w:tr>
+        <w:tc>
+          <w:tcPr>
+            <w:tcW w:w="1705" w:type="dxa"/>
+          </w:tcPr>
+          <w:p>
+            <w:pPr>
+              <w:spacing w:after="16" w:line="259" w:lineRule="auto"/>
+              <w:ind w:left="0" w:right="75" w:firstLine="0"/>
+            </w:pPr>
+            <w:r>
+              <w:t>Outputs</w:t>
+            </w:r>
+          </w:p>
+        </w:tc>
+        <w:tc>
+          <w:tcPr>
+            <w:tcW w:w="7775" w:type="dxa"/>
+          </w:tcPr>
+          <w:p>
+            <w:pPr>
+              <w:spacing w:after="16" w:line="259" w:lineRule="auto"/>
+              <w:ind w:left="0" w:right="75" w:firstLine="0"/>
+            </w:pPr>
+            <w:r>
+              <w:t>Confirmation of form creation</w:t>
+            </w:r>
+          </w:p>
+        </w:tc>
+      </w:tr>
+      <w:tr>
+        <w:tc>
+          <w:tcPr>
+            <w:tcW w:w="1705" w:type="dxa"/>
+          </w:tcPr>
+          <w:p>
+            <w:pPr>
+              <w:spacing w:after="16" w:line="259" w:lineRule="auto"/>
+              <w:ind w:left="0" w:right="75" w:firstLine="0"/>
+            </w:pPr>
+            <w:r>
+              <w:t>Processing</w:t>
+            </w:r>
+          </w:p>
+        </w:tc>
+        <w:tc>
+          <w:tcPr>
+            <w:tcW w:w="7775" w:type="dxa"/>
+          </w:tcPr>
+          <w:p>
+            <w:pPr>
+              <w:pStyle w:val="ListParagraph"/>
+              <w:numPr>
+                <w:ilvl w:val="0"/>
+                <w:numId w:val="16"/>
+              </w:numPr>
+              <w:spacing w:after="16" w:line="259" w:lineRule="auto"/>
+              <w:ind w:right="75"/>
+            </w:pPr>
+            <w:r>
+              <w:t xml:space="preserve">Validate Number of question &gt;= 1 and </w:t>
+            </w:r>
+            <w:r>
+              <w:t>Name or Description is not empty.</w:t>
+            </w:r>
+          </w:p>
+          <w:p>
+            <w:pPr>
+              <w:pStyle w:val="ListParagraph"/>
+              <w:numPr>
+                <w:ilvl w:val="0"/>
+                <w:numId w:val="16"/>
+              </w:numPr>
+              <w:spacing w:after="16" w:line="259" w:lineRule="auto"/>
+              <w:ind w:right="75"/>
+            </w:pPr>
+            <w:r>
+              <w:t>Insert the form information to the questionnaire table.</w:t>
+            </w:r>
+          </w:p>
+        </w:tc>
+      </w:tr>
+      <w:tr>
+        <w:tc>
+          <w:tcPr>
+            <w:tcW w:w="1705" w:type="dxa"/>
+          </w:tcPr>
+          <w:p>
+            <w:pPr>
+              <w:spacing w:after="16" w:line="259" w:lineRule="auto"/>
+              <w:ind w:left="0" w:right="75" w:firstLine="0"/>
+            </w:pPr>
+            <w:r>
+              <w:t>Preconditions</w:t>
+            </w:r>
+          </w:p>
+        </w:tc>
+        <w:tc>
+          <w:tcPr>
+            <w:tcW w:w="7775" w:type="dxa"/>
+          </w:tcPr>
+          <w:p>
+            <w:pPr>
+              <w:pStyle w:val="ListParagraph"/>
+              <w:numPr>
+                <w:ilvl w:val="0"/>
+                <w:numId w:val="17"/>
+              </w:numPr>
+              <w:spacing w:after="16" w:line="259" w:lineRule="auto"/>
+              <w:ind w:right="75"/>
+            </w:pPr>
+            <w:r>
+              <w:t>There must be at least 1 question in question bank.</w:t>
+            </w:r>
+          </w:p>
+          <w:p>
+            <w:pPr>
+              <w:pStyle w:val="ListParagraph"/>
+              <w:numPr>
+                <w:ilvl w:val="0"/>
+                <w:numId w:val="17"/>
+              </w:numPr>
+              <w:spacing w:after="16" w:line="259" w:lineRule="auto"/>
+              <w:ind w:right="75"/>
+            </w:pPr>
+            <w:r>
+              <w:t>All questions to be added in the questionnaire must exist in question bank.</w:t>
+            </w:r>
+          </w:p>
+        </w:tc>
+      </w:tr>
+      <w:tr>
+        <w:tc>
+          <w:tcPr>
+            <w:tcW w:w="1705" w:type="dxa"/>
+          </w:tcPr>
+          <w:p>
+            <w:pPr>
+              <w:spacing w:after="16" w:line="259" w:lineRule="auto"/>
+              <w:ind w:left="0" w:right="75" w:firstLine="0"/>
+            </w:pPr>
+            <w:r>
+              <w:t>Postconditions</w:t>
+            </w:r>
+          </w:p>
+        </w:tc>
+        <w:tc>
+          <w:tcPr>
+            <w:tcW w:w="7775" w:type="dxa"/>
+          </w:tcPr>
+          <w:p>
+            <w:pPr>
+              <w:spacing w:after="16" w:line="259" w:lineRule="auto"/>
+              <w:ind w:left="0" w:right="75" w:firstLine="0"/>
+            </w:pPr>
+            <w:r>
+              <w:t>Form is listed and available for scheduling.</w:t>
+            </w:r>
+          </w:p>
+        </w:tc>
+      </w:tr>
+      <w:tr>
+        <w:tc>
+          <w:tcPr>
+            <w:tcW w:w="1705" w:type="dxa"/>
+          </w:tcPr>
+          <w:p>
+            <w:pPr>
+              <w:spacing w:after="16" w:line="259" w:lineRule="auto"/>
+              <w:ind w:left="0" w:right="75" w:firstLine="0"/>
+            </w:pPr>
+            <w:r>
+              <w:t>Exceptions</w:t>
+            </w:r>
+          </w:p>
+        </w:tc>
+        <w:tc>
+          <w:tcPr>
+            <w:tcW w:w="7775" w:type="dxa"/>
+          </w:tcPr>
+          <w:p>
+            <w:pPr>
+              <w:pStyle w:val="ListParagraph"/>
+              <w:numPr>
+                <w:ilvl w:val="0"/>
+                <w:numId w:val="18"/>
+              </w:numPr>
+              <w:spacing w:after="16" w:line="259" w:lineRule="auto"/>
+              <w:ind w:right="75"/>
+            </w:pPr>
+            <w:r>
+              <w:t>Invalid input in form name or description</w:t>
+            </w:r>
+          </w:p>
+          <w:p>
+            <w:pPr>
+              <w:pStyle w:val="ListParagraph"/>
+              <w:numPr>
+                <w:ilvl w:val="0"/>
+                <w:numId w:val="18"/>
+              </w:numPr>
+              <w:spacing w:after="16" w:line="259" w:lineRule="auto"/>
+              <w:ind w:right="75"/>
+            </w:pPr>
+            <w:r>
+              <w:t>Try saving form with no questions.</w:t>
+            </w:r>
+          </w:p>
+        </w:tc>
+      </w:tr>
+    </w:tbl>
+    <w:p>
+      <w:pPr>
+        <w:spacing w:after="16" w:line="259" w:lineRule="auto"/>
+        <w:ind w:left="0" w:right="75" w:firstLine="0"/>
+      </w:pPr>
       <w:r>
         <w:t xml:space="preserve"> </w:t>
       </w:r>
+    </w:p>
+    <w:p>
+      <w:pPr>
+        <w:spacing w:after="16" w:line="259" w:lineRule="auto"/>
+        <w:ind w:left="0" w:right="75" w:firstLine="0"/>
+      </w:pPr>
+      <w:r>
+        <w:t>User Story 2: Create New Questions</w:t>
+      </w:r>
+    </w:p>
+    <w:tbl>
+      <w:tblPr>
+        <w:tblStyle w:val="TableGrid0"/>
+        <w:tblW w:w="0" w:type="auto"/>
+        <w:tblLook w:val="04A0" w:firstRow="1" w:lastRow="0" w:firstColumn="1" w:lastColumn="0" w:noHBand="0" w:noVBand="1"/>
+      </w:tblPr>
+      <w:tblGrid>
+        <w:gridCol w:w="1705"/>
+        <w:gridCol w:w="7775"/>
+      </w:tblGrid>
+      <w:tr>
+        <w:tc>
+          <w:tcPr>
+            <w:tcW w:w="1705" w:type="dxa"/>
+          </w:tcPr>
+          <w:p>
+            <w:pPr>
+              <w:spacing w:after="16" w:line="259" w:lineRule="auto"/>
+              <w:ind w:left="0" w:right="75" w:firstLine="0"/>
+            </w:pPr>
+            <w:r>
+              <w:t>Inputs</w:t>
+            </w:r>
+          </w:p>
+        </w:tc>
+        <w:tc>
+          <w:tcPr>
+            <w:tcW w:w="7775" w:type="dxa"/>
+          </w:tcPr>
+          <w:p>
+            <w:pPr>
+              <w:spacing w:after="16" w:line="259" w:lineRule="auto"/>
+              <w:ind w:left="0" w:right="75" w:firstLine="0"/>
+            </w:pPr>
+            <w:r>
+              <w:t>Question Type, Question Factor, Question Metadata</w:t>
+            </w:r>
+          </w:p>
+        </w:tc>
+      </w:tr>
+      <w:tr>
+        <w:tc>
+          <w:tcPr>
+            <w:tcW w:w="1705" w:type="dxa"/>
+          </w:tcPr>
+          <w:p>
+            <w:pPr>
+              <w:spacing w:after="16" w:line="259" w:lineRule="auto"/>
+              <w:ind w:left="0" w:right="75" w:firstLine="0"/>
+            </w:pPr>
+            <w:r>
+              <w:t>Outputs</w:t>
+            </w:r>
+          </w:p>
+        </w:tc>
+        <w:tc>
+          <w:tcPr>
+            <w:tcW w:w="7775" w:type="dxa"/>
+          </w:tcPr>
+          <w:p>
+            <w:pPr>
+              <w:spacing w:after="16" w:line="259" w:lineRule="auto"/>
+              <w:ind w:left="0" w:right="75" w:firstLine="0"/>
+            </w:pPr>
+            <w:r>
+              <w:t>Confirmation of the question addition.</w:t>
+            </w:r>
+          </w:p>
+        </w:tc>
+      </w:tr>
+      <w:tr>
+        <w:tc>
+          <w:tcPr>
+            <w:tcW w:w="1705" w:type="dxa"/>
+          </w:tcPr>
+          <w:p>
+            <w:pPr>
+              <w:spacing w:after="16" w:line="259" w:lineRule="auto"/>
+              <w:ind w:left="0" w:right="75" w:firstLine="0"/>
+            </w:pPr>
+            <w:r>
+              <w:t>Processing</w:t>
+            </w:r>
+          </w:p>
+        </w:tc>
+        <w:tc>
+          <w:tcPr>
+            <w:tcW w:w="7775" w:type="dxa"/>
+          </w:tcPr>
+          <w:p>
+            <w:pPr>
+              <w:pStyle w:val="ListParagraph"/>
+              <w:numPr>
+                <w:ilvl w:val="0"/>
+                <w:numId w:val="19"/>
+              </w:numPr>
+              <w:spacing w:after="16" w:line="259" w:lineRule="auto"/>
+              <w:ind w:right="75"/>
+            </w:pPr>
+            <w:r>
+              <w:t>Validate the input fields for invalid values.</w:t>
+            </w:r>
+          </w:p>
+          <w:p>
+            <w:pPr>
+              <w:pStyle w:val="ListParagraph"/>
+              <w:numPr>
+                <w:ilvl w:val="0"/>
+                <w:numId w:val="19"/>
+              </w:numPr>
+              <w:spacing w:after="16" w:line="259" w:lineRule="auto"/>
+              <w:ind w:right="75"/>
+            </w:pPr>
+            <w:r>
+              <w:t>Insert Question to the question table.</w:t>
+            </w:r>
+          </w:p>
+        </w:tc>
+      </w:tr>
+      <w:tr>
+        <w:tc>
+          <w:tcPr>
+            <w:tcW w:w="1705" w:type="dxa"/>
+          </w:tcPr>
+          <w:p>
+            <w:pPr>
+              <w:spacing w:after="16" w:line="259" w:lineRule="auto"/>
+              <w:ind w:left="0" w:right="75" w:firstLine="0"/>
+            </w:pPr>
+            <w:r>
+              <w:t>Preconditions</w:t>
+            </w:r>
+          </w:p>
+        </w:tc>
+        <w:tc>
+          <w:tcPr>
+            <w:tcW w:w="7775" w:type="dxa"/>
+          </w:tcPr>
+          <w:p>
+            <w:pPr>
+              <w:pStyle w:val="ListParagraph"/>
+              <w:numPr>
+                <w:ilvl w:val="0"/>
+                <w:numId w:val="20"/>
+              </w:numPr>
+              <w:spacing w:after="16" w:line="259" w:lineRule="auto"/>
+              <w:ind w:right="75"/>
+            </w:pPr>
+            <w:r>
+              <w:t>Type of allowed questions must be configured.</w:t>
+            </w:r>
+          </w:p>
+          <w:p>
+            <w:pPr>
+              <w:pStyle w:val="ListParagraph"/>
+              <w:numPr>
+                <w:ilvl w:val="0"/>
+                <w:numId w:val="20"/>
+              </w:numPr>
+              <w:spacing w:after="16" w:line="259" w:lineRule="auto"/>
+              <w:ind w:right="75"/>
+            </w:pPr>
+            <w:r>
+              <w:t>Performance factors to be assigned to the questions must be configured.</w:t>
+            </w:r>
+          </w:p>
+        </w:tc>
+      </w:tr>
+      <w:tr>
+        <w:tc>
+          <w:tcPr>
+            <w:tcW w:w="1705" w:type="dxa"/>
+          </w:tcPr>
+          <w:p>
+            <w:pPr>
+              <w:spacing w:after="16" w:line="259" w:lineRule="auto"/>
+              <w:ind w:left="0" w:right="75" w:firstLine="0"/>
+            </w:pPr>
+            <w:r>
+              <w:lastRenderedPageBreak/>
+              <w:t>Postconditions</w:t>
+            </w:r>
+          </w:p>
+        </w:tc>
+        <w:tc>
+          <w:tcPr>
+            <w:tcW w:w="7775" w:type="dxa"/>
+          </w:tcPr>
+          <w:p>
+            <w:pPr>
+              <w:spacing w:after="16" w:line="259" w:lineRule="auto"/>
+              <w:ind w:left="0" w:right="75" w:firstLine="0"/>
+            </w:pPr>
+            <w:r>
+              <w:t>Question is added to the question bank and is available to be used in creating forms.</w:t>
+            </w:r>
+          </w:p>
+        </w:tc>
+      </w:tr>
+      <w:tr>
+        <w:tc>
+          <w:tcPr>
+            <w:tcW w:w="1705" w:type="dxa"/>
+          </w:tcPr>
+          <w:p>
+            <w:pPr>
+              <w:spacing w:after="16" w:line="259" w:lineRule="auto"/>
+              <w:ind w:left="0" w:right="75" w:firstLine="0"/>
+            </w:pPr>
+            <w:r>
+              <w:t>Exceptions</w:t>
+            </w:r>
+          </w:p>
+        </w:tc>
+        <w:tc>
+          <w:tcPr>
+            <w:tcW w:w="7775" w:type="dxa"/>
+          </w:tcPr>
+          <w:p>
+            <w:pPr>
+              <w:pStyle w:val="ListParagraph"/>
+              <w:numPr>
+                <w:ilvl w:val="0"/>
+                <w:numId w:val="24"/>
+              </w:numPr>
+              <w:spacing w:after="16" w:line="259" w:lineRule="auto"/>
+              <w:ind w:right="75"/>
+            </w:pPr>
+            <w:r>
+              <w:t>Question text or metadata is empty.</w:t>
+            </w:r>
+          </w:p>
+          <w:p>
+            <w:pPr>
+              <w:pStyle w:val="ListParagraph"/>
+              <w:numPr>
+                <w:ilvl w:val="0"/>
+                <w:numId w:val="24"/>
+              </w:numPr>
+              <w:spacing w:after="16" w:line="259" w:lineRule="auto"/>
+              <w:ind w:right="75"/>
+            </w:pPr>
+            <w:r>
+              <w:t>Duplicate options added in Likert Type Questions</w:t>
+            </w:r>
+          </w:p>
+          <w:p>
+            <w:pPr>
+              <w:pStyle w:val="ListParagraph"/>
+              <w:numPr>
+                <w:ilvl w:val="0"/>
+                <w:numId w:val="24"/>
+              </w:numPr>
+              <w:spacing w:after="16" w:line="259" w:lineRule="auto"/>
+              <w:ind w:right="75"/>
+            </w:pPr>
+            <w:r>
+              <w:t>Max Slider value is less than Min Slider value in Slider Type Question.</w:t>
+            </w:r>
+          </w:p>
+          <w:p>
+            <w:pPr>
+              <w:pStyle w:val="ListParagraph"/>
+              <w:numPr>
+                <w:ilvl w:val="0"/>
+                <w:numId w:val="24"/>
+              </w:numPr>
+              <w:spacing w:after="16" w:line="259" w:lineRule="auto"/>
+              <w:ind w:right="75"/>
+            </w:pPr>
+            <w:r>
+              <w:t xml:space="preserve">Text input fields </w:t>
+            </w:r>
+            <w:r>
+              <w:t>contain</w:t>
+            </w:r>
+            <w:r>
+              <w:t xml:space="preserve"> invalid inputs.</w:t>
+            </w:r>
+          </w:p>
+        </w:tc>
+      </w:tr>
+    </w:tbl>
+    <w:p>
+      <w:pPr>
+        <w:spacing w:after="16" w:line="259" w:lineRule="auto"/>
+        <w:ind w:left="0" w:right="75" w:firstLine="0"/>
+      </w:pPr>
+    </w:p>
+    <w:p>
+      <w:pPr>
+        <w:spacing w:after="16" w:line="259" w:lineRule="auto"/>
+        <w:ind w:left="0" w:right="75" w:firstLine="0"/>
+      </w:pPr>
+      <w:r>
+        <w:t xml:space="preserve">User Story 3: </w:t>
+      </w:r>
+      <w:r>
+        <w:t>Schedule Feedback</w:t>
+      </w:r>
+    </w:p>
+    <w:tbl>
+      <w:tblPr>
+        <w:tblStyle w:val="TableGrid0"/>
+        <w:tblW w:w="0" w:type="auto"/>
+        <w:tblLook w:val="04A0" w:firstRow="1" w:lastRow="0" w:firstColumn="1" w:lastColumn="0" w:noHBand="0" w:noVBand="1"/>
+      </w:tblPr>
+      <w:tblGrid>
+        <w:gridCol w:w="1705"/>
+        <w:gridCol w:w="7775"/>
+      </w:tblGrid>
+      <w:tr>
+        <w:tc>
+          <w:tcPr>
+            <w:tcW w:w="1705" w:type="dxa"/>
+          </w:tcPr>
+          <w:p>
+            <w:pPr>
+              <w:spacing w:after="16" w:line="259" w:lineRule="auto"/>
+              <w:ind w:left="0" w:right="75" w:firstLine="0"/>
+            </w:pPr>
+            <w:r>
+              <w:t>Inputs</w:t>
+            </w:r>
+          </w:p>
+        </w:tc>
+        <w:tc>
+          <w:tcPr>
+            <w:tcW w:w="7775" w:type="dxa"/>
+          </w:tcPr>
+          <w:p>
+            <w:pPr>
+              <w:spacing w:after="16" w:line="259" w:lineRule="auto"/>
+              <w:ind w:left="0" w:right="75" w:firstLine="0"/>
+            </w:pPr>
+            <w:r>
+              <w:t>Form, department, course, semester, start date, end date</w:t>
+            </w:r>
+          </w:p>
+        </w:tc>
+      </w:tr>
+      <w:tr>
+        <w:tc>
+          <w:tcPr>
+            <w:tcW w:w="1705" w:type="dxa"/>
+          </w:tcPr>
+          <w:p>
+            <w:pPr>
+              <w:spacing w:after="16" w:line="259" w:lineRule="auto"/>
+              <w:ind w:left="0" w:right="75" w:firstLine="0"/>
+            </w:pPr>
+            <w:r>
+              <w:t>Outputs</w:t>
+            </w:r>
+          </w:p>
+        </w:tc>
+        <w:tc>
+          <w:tcPr>
+            <w:tcW w:w="7775" w:type="dxa"/>
+          </w:tcPr>
+          <w:p>
+            <w:pPr>
+              <w:spacing w:after="16" w:line="259" w:lineRule="auto"/>
+              <w:ind w:left="0" w:right="75" w:firstLine="0"/>
+            </w:pPr>
+            <w:r>
+              <w:t>Form is scheduled and will accept responses from start to end date.</w:t>
+            </w:r>
+          </w:p>
+        </w:tc>
+      </w:tr>
+      <w:tr>
+        <w:tc>
+          <w:tcPr>
+            <w:tcW w:w="1705" w:type="dxa"/>
+          </w:tcPr>
+          <w:p>
+            <w:pPr>
+              <w:spacing w:after="16" w:line="259" w:lineRule="auto"/>
+              <w:ind w:left="0" w:right="75" w:firstLine="0"/>
+            </w:pPr>
+            <w:r>
+              <w:t>Processing</w:t>
+            </w:r>
+          </w:p>
+        </w:tc>
+        <w:tc>
+          <w:tcPr>
+            <w:tcW w:w="7775" w:type="dxa"/>
+          </w:tcPr>
+          <w:p>
+            <w:pPr>
+              <w:pStyle w:val="ListParagraph"/>
+              <w:numPr>
+                <w:ilvl w:val="0"/>
+                <w:numId w:val="25"/>
+              </w:numPr>
+              <w:spacing w:after="16" w:line="259" w:lineRule="auto"/>
+              <w:ind w:right="75"/>
+            </w:pPr>
+            <w:r>
+              <w:t>Check if form, department, course existed previously.</w:t>
+            </w:r>
+          </w:p>
+          <w:p>
+            <w:pPr>
+              <w:pStyle w:val="ListParagraph"/>
+              <w:numPr>
+                <w:ilvl w:val="0"/>
+                <w:numId w:val="25"/>
+              </w:numPr>
+              <w:spacing w:after="16" w:line="259" w:lineRule="auto"/>
+              <w:ind w:right="75"/>
+            </w:pPr>
+            <w:r>
+              <w:t>Check if start and end date is within the semester duration, not before or after.</w:t>
+            </w:r>
+          </w:p>
+          <w:p>
+            <w:pPr>
+              <w:pStyle w:val="ListParagraph"/>
+              <w:numPr>
+                <w:ilvl w:val="0"/>
+                <w:numId w:val="25"/>
+              </w:numPr>
+              <w:spacing w:after="16" w:line="259" w:lineRule="auto"/>
+              <w:ind w:right="75"/>
+            </w:pPr>
+            <w:r>
+              <w:t xml:space="preserve">Insert scheduling information to the form schedules mapping table. </w:t>
+            </w:r>
+          </w:p>
+        </w:tc>
+      </w:tr>
+      <w:tr>
+        <w:tc>
+          <w:tcPr>
+            <w:tcW w:w="1705" w:type="dxa"/>
+          </w:tcPr>
+          <w:p>
+            <w:pPr>
+              <w:spacing w:after="16" w:line="259" w:lineRule="auto"/>
+              <w:ind w:left="0" w:right="75" w:firstLine="0"/>
+            </w:pPr>
+            <w:r>
+              <w:t>Preconditions</w:t>
+            </w:r>
+          </w:p>
+        </w:tc>
+        <w:tc>
+          <w:tcPr>
+            <w:tcW w:w="7775" w:type="dxa"/>
+          </w:tcPr>
+          <w:p>
+            <w:pPr>
+              <w:pStyle w:val="ListParagraph"/>
+              <w:numPr>
+                <w:ilvl w:val="0"/>
+                <w:numId w:val="26"/>
+              </w:numPr>
+              <w:spacing w:after="16" w:line="259" w:lineRule="auto"/>
+              <w:ind w:right="75"/>
+            </w:pPr>
+            <w:r>
+              <w:t>Form to be schedule must exist previously.</w:t>
+            </w:r>
+          </w:p>
+          <w:p>
+            <w:pPr>
+              <w:pStyle w:val="ListParagraph"/>
+              <w:numPr>
+                <w:ilvl w:val="0"/>
+                <w:numId w:val="26"/>
+              </w:numPr>
+              <w:spacing w:after="16" w:line="259" w:lineRule="auto"/>
+              <w:ind w:right="75"/>
+            </w:pPr>
+            <w:r>
+              <w:t>Department and Course for which to be scheduled must be present at time of form scheduling.</w:t>
+            </w:r>
+          </w:p>
+          <w:p>
+            <w:pPr>
+              <w:pStyle w:val="ListParagraph"/>
+              <w:numPr>
+                <w:ilvl w:val="0"/>
+                <w:numId w:val="26"/>
+              </w:numPr>
+              <w:spacing w:after="16" w:line="259" w:lineRule="auto"/>
+              <w:ind w:right="75"/>
+            </w:pPr>
+            <w:r>
+              <w:t>Semester for which to be scheduled is not from past.</w:t>
+            </w:r>
+          </w:p>
+        </w:tc>
+      </w:tr>
+      <w:tr>
+        <w:tc>
+          <w:tcPr>
+            <w:tcW w:w="1705" w:type="dxa"/>
+          </w:tcPr>
+          <w:p>
+            <w:pPr>
+              <w:spacing w:after="16" w:line="259" w:lineRule="auto"/>
+              <w:ind w:left="0" w:right="75" w:firstLine="0"/>
+            </w:pPr>
+            <w:r>
+              <w:t>Postconditions</w:t>
+            </w:r>
+          </w:p>
+        </w:tc>
+        <w:tc>
+          <w:tcPr>
+            <w:tcW w:w="7775" w:type="dxa"/>
+          </w:tcPr>
+          <w:p>
+            <w:pPr>
+              <w:spacing w:after="16" w:line="259" w:lineRule="auto"/>
+              <w:ind w:left="0" w:right="75" w:firstLine="0"/>
+            </w:pPr>
+            <w:r>
+              <w:t>Students can see and submit the form with appropriate repsones.</w:t>
+            </w:r>
+          </w:p>
+        </w:tc>
+      </w:tr>
+      <w:tr>
+        <w:tc>
+          <w:tcPr>
+            <w:tcW w:w="1705" w:type="dxa"/>
+          </w:tcPr>
+          <w:p>
+            <w:pPr>
+              <w:spacing w:after="16" w:line="259" w:lineRule="auto"/>
+              <w:ind w:left="0" w:right="75" w:firstLine="0"/>
+            </w:pPr>
+            <w:r>
+              <w:t>Exceptions</w:t>
+            </w:r>
+          </w:p>
+        </w:tc>
+        <w:tc>
+          <w:tcPr>
+            <w:tcW w:w="7775" w:type="dxa"/>
+          </w:tcPr>
+          <w:p>
+            <w:pPr>
+              <w:pStyle w:val="ListParagraph"/>
+              <w:numPr>
+                <w:ilvl w:val="0"/>
+                <w:numId w:val="27"/>
+              </w:numPr>
+              <w:spacing w:after="16" w:line="259" w:lineRule="auto"/>
+              <w:ind w:right="75"/>
+            </w:pPr>
+            <w:r>
+              <w:t>Scheduled date is out of semester bound.</w:t>
+            </w:r>
+          </w:p>
+          <w:p>
+            <w:pPr>
+              <w:pStyle w:val="ListParagraph"/>
+              <w:numPr>
+                <w:ilvl w:val="0"/>
+                <w:numId w:val="27"/>
+              </w:numPr>
+              <w:spacing w:after="16" w:line="259" w:lineRule="auto"/>
+              <w:ind w:right="75"/>
+            </w:pPr>
+            <w:r>
+              <w:t>Form, Department, or Course does not exist previously.</w:t>
+            </w:r>
+          </w:p>
+        </w:tc>
+      </w:tr>
+    </w:tbl>
+    <w:p>
+      <w:pPr>
+        <w:spacing w:after="16" w:line="259" w:lineRule="auto"/>
+        <w:ind w:left="0" w:right="75" w:firstLine="0"/>
+      </w:pPr>
+    </w:p>
+    <w:p>
+      <w:pPr>
+        <w:spacing w:after="16" w:line="259" w:lineRule="auto"/>
+        <w:ind w:left="0" w:right="75" w:firstLine="0"/>
+      </w:pPr>
+      <w:r>
+        <w:t>User Story 4: HOD access panel</w:t>
+      </w:r>
+    </w:p>
+    <w:tbl>
+      <w:tblPr>
+        <w:tblStyle w:val="TableGrid0"/>
+        <w:tblW w:w="0" w:type="auto"/>
+        <w:tblLook w:val="04A0" w:firstRow="1" w:lastRow="0" w:firstColumn="1" w:lastColumn="0" w:noHBand="0" w:noVBand="1"/>
+      </w:tblPr>
+      <w:tblGrid>
+        <w:gridCol w:w="1705"/>
+        <w:gridCol w:w="7775"/>
+      </w:tblGrid>
+      <w:tr>
+        <w:tc>
+          <w:tcPr>
+            <w:tcW w:w="1705" w:type="dxa"/>
+          </w:tcPr>
+          <w:p>
+            <w:pPr>
+              <w:spacing w:after="16" w:line="259" w:lineRule="auto"/>
+              <w:ind w:left="0" w:right="75" w:firstLine="0"/>
+            </w:pPr>
+            <w:r>
+              <w:t>Inputs</w:t>
+            </w:r>
+          </w:p>
+        </w:tc>
+        <w:tc>
+          <w:tcPr>
+            <w:tcW w:w="7775" w:type="dxa"/>
+          </w:tcPr>
+          <w:p>
+            <w:pPr>
+              <w:spacing w:after="16" w:line="259" w:lineRule="auto"/>
+              <w:ind w:left="0" w:right="75" w:firstLine="0"/>
+            </w:pPr>
+            <w:r>
+              <w:t>HOD login credentials</w:t>
+            </w:r>
+          </w:p>
+        </w:tc>
+      </w:tr>
+      <w:tr>
+        <w:tc>
+          <w:tcPr>
+            <w:tcW w:w="1705" w:type="dxa"/>
+          </w:tcPr>
+          <w:p>
+            <w:pPr>
+              <w:spacing w:after="16" w:line="259" w:lineRule="auto"/>
+              <w:ind w:left="0" w:right="75" w:firstLine="0"/>
+            </w:pPr>
+            <w:r>
+              <w:t>Outputs</w:t>
+            </w:r>
+          </w:p>
+        </w:tc>
+        <w:tc>
+          <w:tcPr>
+            <w:tcW w:w="7775" w:type="dxa"/>
+          </w:tcPr>
+          <w:p>
+            <w:pPr>
+              <w:spacing w:after="16" w:line="259" w:lineRule="auto"/>
+              <w:ind w:left="0" w:right="75" w:firstLine="0"/>
+            </w:pPr>
+            <w:r>
+              <w:t>HOD dashboard interface and all of its functionality</w:t>
+            </w:r>
+          </w:p>
+        </w:tc>
+      </w:tr>
+      <w:tr>
+        <w:tc>
+          <w:tcPr>
+            <w:tcW w:w="1705" w:type="dxa"/>
+          </w:tcPr>
+          <w:p>
+            <w:pPr>
+              <w:spacing w:after="16" w:line="259" w:lineRule="auto"/>
+              <w:ind w:left="0" w:right="75" w:firstLine="0"/>
+            </w:pPr>
+            <w:r>
+              <w:t>Processing</w:t>
+            </w:r>
+          </w:p>
+        </w:tc>
+        <w:tc>
+          <w:tcPr>
+            <w:tcW w:w="7775" w:type="dxa"/>
+          </w:tcPr>
+          <w:p>
+            <w:pPr>
+              <w:pStyle w:val="ListParagraph"/>
+              <w:numPr>
+                <w:ilvl w:val="0"/>
+                <w:numId w:val="28"/>
+              </w:numPr>
+              <w:spacing w:after="16" w:line="259" w:lineRule="auto"/>
+              <w:ind w:right="75"/>
+            </w:pPr>
+            <w:r>
+              <w:t>Authenticate HOD credentials</w:t>
+            </w:r>
+          </w:p>
+          <w:p>
+            <w:pPr>
+              <w:pStyle w:val="ListParagraph"/>
+              <w:numPr>
+                <w:ilvl w:val="0"/>
+                <w:numId w:val="28"/>
+              </w:numPr>
+              <w:spacing w:after="16" w:line="259" w:lineRule="auto"/>
+              <w:ind w:right="75"/>
+            </w:pPr>
+            <w:r>
+              <w:t>Fetch relevant data to be displayed in dashboard</w:t>
+            </w:r>
+          </w:p>
+          <w:p>
+            <w:pPr>
+              <w:pStyle w:val="ListParagraph"/>
+              <w:numPr>
+                <w:ilvl w:val="0"/>
+                <w:numId w:val="28"/>
+              </w:numPr>
+              <w:spacing w:after="16" w:line="259" w:lineRule="auto"/>
+              <w:ind w:right="75"/>
+            </w:pPr>
+            <w:r>
+              <w:t>Display the UI components (buttons, graphs, tabs…)</w:t>
+            </w:r>
+          </w:p>
+        </w:tc>
+      </w:tr>
+      <w:tr>
+        <w:tc>
+          <w:tcPr>
+            <w:tcW w:w="1705" w:type="dxa"/>
+          </w:tcPr>
+          <w:p>
+            <w:pPr>
+              <w:spacing w:after="16" w:line="259" w:lineRule="auto"/>
+              <w:ind w:left="0" w:right="75" w:firstLine="0"/>
+            </w:pPr>
+            <w:r>
+              <w:t>Preconditions</w:t>
+            </w:r>
+          </w:p>
+        </w:tc>
+        <w:tc>
+          <w:tcPr>
+            <w:tcW w:w="7775" w:type="dxa"/>
+          </w:tcPr>
+          <w:p>
+            <w:pPr>
+              <w:spacing w:after="16" w:line="259" w:lineRule="auto"/>
+              <w:ind w:left="0" w:right="75" w:firstLine="0"/>
+            </w:pPr>
+            <w:r>
+              <w:t>HOD must be registered and logged in</w:t>
+            </w:r>
+          </w:p>
+        </w:tc>
+      </w:tr>
+      <w:tr>
+        <w:tc>
+          <w:tcPr>
+            <w:tcW w:w="1705" w:type="dxa"/>
+          </w:tcPr>
+          <w:p>
+            <w:pPr>
+              <w:spacing w:after="16" w:line="259" w:lineRule="auto"/>
+              <w:ind w:left="0" w:right="75" w:firstLine="0"/>
+            </w:pPr>
+            <w:r>
+              <w:t>Postconditions</w:t>
+            </w:r>
+          </w:p>
+        </w:tc>
+        <w:tc>
+          <w:tcPr>
+            <w:tcW w:w="7775" w:type="dxa"/>
+          </w:tcPr>
+          <w:p>
+            <w:pPr>
+              <w:spacing w:after="16" w:line="259" w:lineRule="auto"/>
+              <w:ind w:left="0" w:right="75" w:firstLine="0"/>
+            </w:pPr>
+            <w:r>
+              <w:t>HOD have access to see and use HOD dashboard</w:t>
+            </w:r>
+          </w:p>
+        </w:tc>
+      </w:tr>
+      <w:tr>
+        <w:tc>
+          <w:tcPr>
+            <w:tcW w:w="1705" w:type="dxa"/>
+          </w:tcPr>
+          <w:p>
+            <w:pPr>
+              <w:spacing w:after="16" w:line="259" w:lineRule="auto"/>
+              <w:ind w:left="0" w:right="75" w:firstLine="0"/>
+            </w:pPr>
+            <w:r>
+              <w:t>Exceptions</w:t>
+            </w:r>
+          </w:p>
+        </w:tc>
+        <w:tc>
+          <w:tcPr>
+            <w:tcW w:w="7775" w:type="dxa"/>
+          </w:tcPr>
+          <w:p>
+            <w:pPr>
+              <w:pStyle w:val="ListParagraph"/>
+              <w:numPr>
+                <w:ilvl w:val="0"/>
+                <w:numId w:val="29"/>
+              </w:numPr>
+              <w:spacing w:after="16" w:line="259" w:lineRule="auto"/>
+              <w:ind w:right="75"/>
+            </w:pPr>
+            <w:r>
+              <w:t>Invalid Credentials</w:t>
+            </w:r>
+          </w:p>
+          <w:p>
+            <w:pPr>
+              <w:pStyle w:val="ListParagraph"/>
+              <w:numPr>
+                <w:ilvl w:val="0"/>
+                <w:numId w:val="29"/>
+              </w:numPr>
+              <w:spacing w:after="16" w:line="259" w:lineRule="auto"/>
+              <w:ind w:right="75"/>
+            </w:pPr>
+            <w:r>
+              <w:t>Data retrieval failure</w:t>
+            </w:r>
+          </w:p>
+        </w:tc>
+      </w:tr>
+    </w:tbl>
+    <w:p>
+      <w:pPr>
+        <w:spacing w:after="16" w:line="259" w:lineRule="auto"/>
+        <w:ind w:left="0" w:right="75" w:firstLine="0"/>
+      </w:pPr>
     </w:p>
     <w:p>
       <w:pPr>
@@ -1823,6 +2936,95 @@
 <file path=word/numbering.xml><?xml version="1.0" encoding="utf-8"?>
 <w:numbering xmlns:wpc="http://schemas.microsoft.com/office/word/2010/wordprocessingCanvas" xmlns:cx="http://schemas.microsoft.com/office/drawing/2014/chartex" xmlns:cx1="http://schemas.microsoft.com/office/drawing/2015/9/8/chartex" xmlns:cx2="http://schemas.microsoft.com/office/drawing/2015/10/21/chartex" xmlns:cx3="http://schemas.microsoft.com/office/drawing/2016/5/9/chartex" xmlns:cx4="http://schemas.microsoft.com/office/drawing/2016/5/10/chartex" xmlns:cx5="http://schemas.microsoft.com/office/drawing/2016/5/11/chartex" xmlns:cx6="http://schemas.microsoft.com/office/drawing/2016/5/12/chartex" xmlns:cx7="http://schemas.microsoft.com/office/drawing/2016/5/13/chartex" xmlns:cx8="http://schemas.microsoft.com/office/drawing/2016/5/14/chartex" xmlns:mc="http://schemas.openxmlformats.org/markup-compatibility/2006" xmlns:aink="http://schemas.microsoft.com/office/drawing/2016/ink" xmlns:am3d="http://schemas.microsoft.com/office/drawing/2017/model3d" xmlns:o="urn:schemas-microsoft-com:office:office" xmlns:oel="http://schemas.microsoft.com/office/2019/extlst" xmlns:r="http://schemas.openxmlformats.org/officeDocument/2006/relationships" xmlns:m="http://schemas.openxmlformats.org/officeDocument/2006/math" xmlns:v="urn:schemas-microsoft-com:vml" xmlns:wp14="http://schemas.microsoft.com/office/word/2010/wordprocessingDrawing" xmlns:wp="http://schemas.openxmlformats.org/drawingml/2006/wordprocessingDrawing" xmlns:w10="urn:schemas-microsoft-com:office:word" xmlns:w="http://schemas.openxmlformats.org/wordprocessingml/2006/main" xmlns:w14="http://schemas.microsoft.com/office/word/2010/wordml" xmlns:w15="http://schemas.microsoft.com/office/word/2012/wordml" xmlns:w16cex="http://schemas.microsoft.com/office/word/2018/wordml/cex" xmlns:w16cid="http://schemas.microsoft.com/office/word/2016/wordml/cid" xmlns:w16="http://schemas.microsoft.com/office/word/2018/wordml" xmlns:w16du="http://schemas.microsoft.com/office/word/2023/wordml/word16du" xmlns:w16sdtdh="http://schemas.microsoft.com/office/word/2020/wordml/sdtdatahash" xmlns:w16sdtfl="http://schemas.microsoft.com/office/word/2024/wordml/sdtformatlock" xmlns:w16se="http://schemas.microsoft.com/office/word/2015/wordml/symex" xmlns:wpg="http://schemas.microsoft.com/office/word/2010/wordprocessingGroup" xmlns:wpi="http://schemas.microsoft.com/office/word/2010/wordprocessingInk" xmlns:wne="http://schemas.microsoft.com/office/word/2006/wordml" xmlns:wps="http://schemas.microsoft.com/office/word/2010/wordprocessingShape" mc:Ignorable="w14 w15 w16se w16cid w16 w16cex w16sdtdh w16sdtfl w16du wp14">
   <w:abstractNum w:abstractNumId="0" w15:restartNumberingAfterBreak="0">
+    <w:nsid w:val="02634B55"/>
+    <w:multiLevelType w:val="hybridMultilevel"/>
+    <w:tmpl w:val="E03CFCB2"/>
+    <w:lvl w:ilvl="0" w:tplc="4C09000F">
+      <w:start w:val="1"/>
+      <w:numFmt w:val="decimal"/>
+      <w:lvlText w:val="%1."/>
+      <w:lvlJc w:val="left"/>
+      <w:pPr>
+        <w:ind w:left="720" w:hanging="360"/>
+      </w:pPr>
+      <w:rPr>
+        <w:rFonts w:hint="default"/>
+      </w:rPr>
+    </w:lvl>
+    <w:lvl w:ilvl="1" w:tplc="4C090019" w:tentative="1">
+      <w:start w:val="1"/>
+      <w:numFmt w:val="lowerLetter"/>
+      <w:lvlText w:val="%2."/>
+      <w:lvlJc w:val="left"/>
+      <w:pPr>
+        <w:ind w:left="1440" w:hanging="360"/>
+      </w:pPr>
+    </w:lvl>
+    <w:lvl w:ilvl="2" w:tplc="4C09001B" w:tentative="1">
+      <w:start w:val="1"/>
+      <w:numFmt w:val="lowerRoman"/>
+      <w:lvlText w:val="%3."/>
+      <w:lvlJc w:val="right"/>
+      <w:pPr>
+        <w:ind w:left="2160" w:hanging="180"/>
+      </w:pPr>
+    </w:lvl>
+    <w:lvl w:ilvl="3" w:tplc="4C09000F" w:tentative="1">
+      <w:start w:val="1"/>
+      <w:numFmt w:val="decimal"/>
+      <w:lvlText w:val="%4."/>
+      <w:lvlJc w:val="left"/>
+      <w:pPr>
+        <w:ind w:left="2880" w:hanging="360"/>
+      </w:pPr>
+    </w:lvl>
+    <w:lvl w:ilvl="4" w:tplc="4C090019" w:tentative="1">
+      <w:start w:val="1"/>
+      <w:numFmt w:val="lowerLetter"/>
+      <w:lvlText w:val="%5."/>
+      <w:lvlJc w:val="left"/>
+      <w:pPr>
+        <w:ind w:left="3600" w:hanging="360"/>
+      </w:pPr>
+    </w:lvl>
+    <w:lvl w:ilvl="5" w:tplc="4C09001B" w:tentative="1">
+      <w:start w:val="1"/>
+      <w:numFmt w:val="lowerRoman"/>
+      <w:lvlText w:val="%6."/>
+      <w:lvlJc w:val="right"/>
+      <w:pPr>
+        <w:ind w:left="4320" w:hanging="180"/>
+      </w:pPr>
+    </w:lvl>
+    <w:lvl w:ilvl="6" w:tplc="4C09000F" w:tentative="1">
+      <w:start w:val="1"/>
+      <w:numFmt w:val="decimal"/>
+      <w:lvlText w:val="%7."/>
+      <w:lvlJc w:val="left"/>
+      <w:pPr>
+        <w:ind w:left="5040" w:hanging="360"/>
+      </w:pPr>
+    </w:lvl>
+    <w:lvl w:ilvl="7" w:tplc="4C090019" w:tentative="1">
+      <w:start w:val="1"/>
+      <w:numFmt w:val="lowerLetter"/>
+      <w:lvlText w:val="%8."/>
+      <w:lvlJc w:val="left"/>
+      <w:pPr>
+        <w:ind w:left="5760" w:hanging="360"/>
+      </w:pPr>
+    </w:lvl>
+    <w:lvl w:ilvl="8" w:tplc="4C09001B" w:tentative="1">
+      <w:start w:val="1"/>
+      <w:numFmt w:val="lowerRoman"/>
+      <w:lvlText w:val="%9."/>
+      <w:lvlJc w:val="right"/>
+      <w:pPr>
+        <w:ind w:left="6480" w:hanging="180"/>
+      </w:pPr>
+    </w:lvl>
+  </w:abstractNum>
+  <w:abstractNum w:abstractNumId="1" w15:restartNumberingAfterBreak="0">
     <w:nsid w:val="03B450B2"/>
     <w:multiLevelType w:val="hybridMultilevel"/>
     <w:tmpl w:val="ED3E2BC4"/>
@@ -2034,7 +3236,7 @@
       </w:rPr>
     </w:lvl>
   </w:abstractNum>
-  <w:abstractNum w:abstractNumId="1" w15:restartNumberingAfterBreak="0">
+  <w:abstractNum w:abstractNumId="2" w15:restartNumberingAfterBreak="0">
     <w:nsid w:val="05152495"/>
     <w:multiLevelType w:val="hybridMultilevel"/>
     <w:tmpl w:val="31422E88"/>
@@ -2246,7 +3448,7 @@
       </w:rPr>
     </w:lvl>
   </w:abstractNum>
-  <w:abstractNum w:abstractNumId="2" w15:restartNumberingAfterBreak="0">
+  <w:abstractNum w:abstractNumId="3" w15:restartNumberingAfterBreak="0">
     <w:nsid w:val="08514196"/>
     <w:multiLevelType w:val="hybridMultilevel"/>
     <w:tmpl w:val="A7EA4E52"/>
@@ -2458,7 +3660,96 @@
       </w:rPr>
     </w:lvl>
   </w:abstractNum>
-  <w:abstractNum w:abstractNumId="3" w15:restartNumberingAfterBreak="0">
+  <w:abstractNum w:abstractNumId="4" w15:restartNumberingAfterBreak="0">
+    <w:nsid w:val="092C1577"/>
+    <w:multiLevelType w:val="hybridMultilevel"/>
+    <w:tmpl w:val="5FA0FDA8"/>
+    <w:lvl w:ilvl="0" w:tplc="4C09000F">
+      <w:start w:val="1"/>
+      <w:numFmt w:val="decimal"/>
+      <w:lvlText w:val="%1."/>
+      <w:lvlJc w:val="left"/>
+      <w:pPr>
+        <w:ind w:left="720" w:hanging="360"/>
+      </w:pPr>
+      <w:rPr>
+        <w:rFonts w:hint="default"/>
+      </w:rPr>
+    </w:lvl>
+    <w:lvl w:ilvl="1" w:tplc="4C090019" w:tentative="1">
+      <w:start w:val="1"/>
+      <w:numFmt w:val="lowerLetter"/>
+      <w:lvlText w:val="%2."/>
+      <w:lvlJc w:val="left"/>
+      <w:pPr>
+        <w:ind w:left="1440" w:hanging="360"/>
+      </w:pPr>
+    </w:lvl>
+    <w:lvl w:ilvl="2" w:tplc="4C09001B" w:tentative="1">
+      <w:start w:val="1"/>
+      <w:numFmt w:val="lowerRoman"/>
+      <w:lvlText w:val="%3."/>
+      <w:lvlJc w:val="right"/>
+      <w:pPr>
+        <w:ind w:left="2160" w:hanging="180"/>
+      </w:pPr>
+    </w:lvl>
+    <w:lvl w:ilvl="3" w:tplc="4C09000F" w:tentative="1">
+      <w:start w:val="1"/>
+      <w:numFmt w:val="decimal"/>
+      <w:lvlText w:val="%4."/>
+      <w:lvlJc w:val="left"/>
+      <w:pPr>
+        <w:ind w:left="2880" w:hanging="360"/>
+      </w:pPr>
+    </w:lvl>
+    <w:lvl w:ilvl="4" w:tplc="4C090019" w:tentative="1">
+      <w:start w:val="1"/>
+      <w:numFmt w:val="lowerLetter"/>
+      <w:lvlText w:val="%5."/>
+      <w:lvlJc w:val="left"/>
+      <w:pPr>
+        <w:ind w:left="3600" w:hanging="360"/>
+      </w:pPr>
+    </w:lvl>
+    <w:lvl w:ilvl="5" w:tplc="4C09001B" w:tentative="1">
+      <w:start w:val="1"/>
+      <w:numFmt w:val="lowerRoman"/>
+      <w:lvlText w:val="%6."/>
+      <w:lvlJc w:val="right"/>
+      <w:pPr>
+        <w:ind w:left="4320" w:hanging="180"/>
+      </w:pPr>
+    </w:lvl>
+    <w:lvl w:ilvl="6" w:tplc="4C09000F" w:tentative="1">
+      <w:start w:val="1"/>
+      <w:numFmt w:val="decimal"/>
+      <w:lvlText w:val="%7."/>
+      <w:lvlJc w:val="left"/>
+      <w:pPr>
+        <w:ind w:left="5040" w:hanging="360"/>
+      </w:pPr>
+    </w:lvl>
+    <w:lvl w:ilvl="7" w:tplc="4C090019" w:tentative="1">
+      <w:start w:val="1"/>
+      <w:numFmt w:val="lowerLetter"/>
+      <w:lvlText w:val="%8."/>
+      <w:lvlJc w:val="left"/>
+      <w:pPr>
+        <w:ind w:left="5760" w:hanging="360"/>
+      </w:pPr>
+    </w:lvl>
+    <w:lvl w:ilvl="8" w:tplc="4C09001B" w:tentative="1">
+      <w:start w:val="1"/>
+      <w:numFmt w:val="lowerRoman"/>
+      <w:lvlText w:val="%9."/>
+      <w:lvlJc w:val="right"/>
+      <w:pPr>
+        <w:ind w:left="6480" w:hanging="180"/>
+      </w:pPr>
+    </w:lvl>
+  </w:abstractNum>
+  <w:abstractNum w:abstractNumId="5" w15:restartNumberingAfterBreak="0">
     <w:nsid w:val="09577D3F"/>
     <w:multiLevelType w:val="hybridMultilevel"/>
     <w:tmpl w:val="40EE79C6"/>
@@ -2670,7 +3961,209 @@
       </w:rPr>
     </w:lvl>
   </w:abstractNum>
-  <w:abstractNum w:abstractNumId="4" w15:restartNumberingAfterBreak="0">
+  <w:abstractNum w:abstractNumId="6" w15:restartNumberingAfterBreak="0">
+    <w:nsid w:val="0DCB4CEE"/>
+    <w:multiLevelType w:val="hybridMultilevel"/>
+    <w:tmpl w:val="975081C8"/>
+    <w:lvl w:ilvl="0" w:tplc="52061856">
+      <w:start w:val="1"/>
+      <w:numFmt w:val="decimal"/>
+      <w:lvlText w:val="%1."/>
+      <w:lvlJc w:val="left"/>
+      <w:pPr>
+        <w:ind w:left="1080" w:hanging="360"/>
+      </w:pPr>
+      <w:rPr>
+        <w:rFonts w:ascii="Times New Roman" w:eastAsia="Times New Roman" w:hAnsi="Times New Roman" w:cs="Times New Roman"/>
+      </w:rPr>
+    </w:lvl>
+    <w:lvl w:ilvl="1" w:tplc="4C090003" w:tentative="1">
+      <w:start w:val="1"/>
+      <w:numFmt w:val="bullet"/>
+      <w:lvlText w:val="o"/>
+      <w:lvlJc w:val="left"/>
+      <w:pPr>
+        <w:ind w:left="1800" w:hanging="360"/>
+      </w:pPr>
+      <w:rPr>
+        <w:rFonts w:ascii="Courier New" w:hAnsi="Courier New" w:cs="Courier New" w:hint="default"/>
+      </w:rPr>
+    </w:lvl>
+    <w:lvl w:ilvl="2" w:tplc="4C090005" w:tentative="1">
+      <w:start w:val="1"/>
+      <w:numFmt w:val="bullet"/>
+      <w:lvlText w:val=""/>
+      <w:lvlJc w:val="left"/>
+      <w:pPr>
+        <w:ind w:left="2520" w:hanging="360"/>
+      </w:pPr>
+      <w:rPr>
+        <w:rFonts w:ascii="Wingdings" w:hAnsi="Wingdings" w:hint="default"/>
+      </w:rPr>
+    </w:lvl>
+    <w:lvl w:ilvl="3" w:tplc="4C090001" w:tentative="1">
+      <w:start w:val="1"/>
+      <w:numFmt w:val="bullet"/>
+      <w:lvlText w:val=""/>
+      <w:lvlJc w:val="left"/>
+      <w:pPr>
+        <w:ind w:left="3240" w:hanging="360"/>
+      </w:pPr>
+      <w:rPr>
+        <w:rFonts w:ascii="Symbol" w:hAnsi="Symbol" w:hint="default"/>
+      </w:rPr>
+    </w:lvl>
+    <w:lvl w:ilvl="4" w:tplc="4C090003" w:tentative="1">
+      <w:start w:val="1"/>
+      <w:numFmt w:val="bullet"/>
+      <w:lvlText w:val="o"/>
+      <w:lvlJc w:val="left"/>
+      <w:pPr>
+        <w:ind w:left="3960" w:hanging="360"/>
+      </w:pPr>
+      <w:rPr>
+        <w:rFonts w:ascii="Courier New" w:hAnsi="Courier New" w:cs="Courier New" w:hint="default"/>
+      </w:rPr>
+    </w:lvl>
+    <w:lvl w:ilvl="5" w:tplc="4C090005" w:tentative="1">
+      <w:start w:val="1"/>
+      <w:numFmt w:val="bullet"/>
+      <w:lvlText w:val=""/>
+      <w:lvlJc w:val="left"/>
+      <w:pPr>
+        <w:ind w:left="4680" w:hanging="360"/>
+      </w:pPr>
+      <w:rPr>
+        <w:rFonts w:ascii="Wingdings" w:hAnsi="Wingdings" w:hint="default"/>
+      </w:rPr>
+    </w:lvl>
+    <w:lvl w:ilvl="6" w:tplc="4C090001" w:tentative="1">
+      <w:start w:val="1"/>
+      <w:numFmt w:val="bullet"/>
+      <w:lvlText w:val=""/>
+      <w:lvlJc w:val="left"/>
+      <w:pPr>
+        <w:ind w:left="5400" w:hanging="360"/>
+      </w:pPr>
+      <w:rPr>
+        <w:rFonts w:ascii="Symbol" w:hAnsi="Symbol" w:hint="default"/>
+      </w:rPr>
+    </w:lvl>
+    <w:lvl w:ilvl="7" w:tplc="4C090003" w:tentative="1">
+      <w:start w:val="1"/>
+      <w:numFmt w:val="bullet"/>
+      <w:lvlText w:val="o"/>
+      <w:lvlJc w:val="left"/>
+      <w:pPr>
+        <w:ind w:left="6120" w:hanging="360"/>
+      </w:pPr>
+      <w:rPr>
+        <w:rFonts w:ascii="Courier New" w:hAnsi="Courier New" w:cs="Courier New" w:hint="default"/>
+      </w:rPr>
+    </w:lvl>
+    <w:lvl w:ilvl="8" w:tplc="4C090005" w:tentative="1">
+      <w:start w:val="1"/>
+      <w:numFmt w:val="bullet"/>
+      <w:lvlText w:val=""/>
+      <w:lvlJc w:val="left"/>
+      <w:pPr>
+        <w:ind w:left="6840" w:hanging="360"/>
+      </w:pPr>
+      <w:rPr>
+        <w:rFonts w:ascii="Wingdings" w:hAnsi="Wingdings" w:hint="default"/>
+      </w:rPr>
+    </w:lvl>
+  </w:abstractNum>
+  <w:abstractNum w:abstractNumId="7" w15:restartNumberingAfterBreak="0">
+    <w:nsid w:val="0F4B56A8"/>
+    <w:multiLevelType w:val="hybridMultilevel"/>
+    <w:tmpl w:val="3ACADAFE"/>
+    <w:lvl w:ilvl="0" w:tplc="4C09000F">
+      <w:start w:val="1"/>
+      <w:numFmt w:val="decimal"/>
+      <w:lvlText w:val="%1."/>
+      <w:lvlJc w:val="left"/>
+      <w:pPr>
+        <w:ind w:left="720" w:hanging="360"/>
+      </w:pPr>
+      <w:rPr>
+        <w:rFonts w:hint="default"/>
+      </w:rPr>
+    </w:lvl>
+    <w:lvl w:ilvl="1" w:tplc="4C090019" w:tentative="1">
+      <w:start w:val="1"/>
+      <w:numFmt w:val="lowerLetter"/>
+      <w:lvlText w:val="%2."/>
+      <w:lvlJc w:val="left"/>
+      <w:pPr>
+        <w:ind w:left="1440" w:hanging="360"/>
+      </w:pPr>
+    </w:lvl>
+    <w:lvl w:ilvl="2" w:tplc="4C09001B" w:tentative="1">
+      <w:start w:val="1"/>
+      <w:numFmt w:val="lowerRoman"/>
+      <w:lvlText w:val="%3."/>
+      <w:lvlJc w:val="right"/>
+      <w:pPr>
+        <w:ind w:left="2160" w:hanging="180"/>
+      </w:pPr>
+    </w:lvl>
+    <w:lvl w:ilvl="3" w:tplc="4C09000F" w:tentative="1">
+      <w:start w:val="1"/>
+      <w:numFmt w:val="decimal"/>
+      <w:lvlText w:val="%4."/>
+      <w:lvlJc w:val="left"/>
+      <w:pPr>
+        <w:ind w:left="2880" w:hanging="360"/>
+      </w:pPr>
+    </w:lvl>
+    <w:lvl w:ilvl="4" w:tplc="4C090019" w:tentative="1">
+      <w:start w:val="1"/>
+      <w:numFmt w:val="lowerLetter"/>
+      <w:lvlText w:val="%5."/>
+      <w:lvlJc w:val="left"/>
+      <w:pPr>
+        <w:ind w:left="3600" w:hanging="360"/>
+      </w:pPr>
+    </w:lvl>
+    <w:lvl w:ilvl="5" w:tplc="4C09001B" w:tentative="1">
+      <w:start w:val="1"/>
+      <w:numFmt w:val="lowerRoman"/>
+      <w:lvlText w:val="%6."/>
+      <w:lvlJc w:val="right"/>
+      <w:pPr>
+        <w:ind w:left="4320" w:hanging="180"/>
+      </w:pPr>
+    </w:lvl>
+    <w:lvl w:ilvl="6" w:tplc="4C09000F" w:tentative="1">
+      <w:start w:val="1"/>
+      <w:numFmt w:val="decimal"/>
+      <w:lvlText w:val="%7."/>
+      <w:lvlJc w:val="left"/>
+      <w:pPr>
+        <w:ind w:left="5040" w:hanging="360"/>
+      </w:pPr>
+    </w:lvl>
+    <w:lvl w:ilvl="7" w:tplc="4C090019" w:tentative="1">
+      <w:start w:val="1"/>
+      <w:numFmt w:val="lowerLetter"/>
+      <w:lvlText w:val="%8."/>
+      <w:lvlJc w:val="left"/>
+      <w:pPr>
+        <w:ind w:left="5760" w:hanging="360"/>
+      </w:pPr>
+    </w:lvl>
+    <w:lvl w:ilvl="8" w:tplc="4C09001B" w:tentative="1">
+      <w:start w:val="1"/>
+      <w:numFmt w:val="lowerRoman"/>
+      <w:lvlText w:val="%9."/>
+      <w:lvlJc w:val="right"/>
+      <w:pPr>
+        <w:ind w:left="6480" w:hanging="180"/>
+      </w:pPr>
+    </w:lvl>
+  </w:abstractNum>
+  <w:abstractNum w:abstractNumId="8" w15:restartNumberingAfterBreak="0">
     <w:nsid w:val="155809C6"/>
     <w:multiLevelType w:val="hybridMultilevel"/>
     <w:tmpl w:val="325C6BB2"/>
@@ -2882,7 +4375,7 @@
       </w:rPr>
     </w:lvl>
   </w:abstractNum>
-  <w:abstractNum w:abstractNumId="5" w15:restartNumberingAfterBreak="0">
+  <w:abstractNum w:abstractNumId="9" w15:restartNumberingAfterBreak="0">
     <w:nsid w:val="18B04403"/>
     <w:multiLevelType w:val="hybridMultilevel"/>
     <w:tmpl w:val="B0BE1048"/>
@@ -3094,7 +4587,185 @@
       </w:rPr>
     </w:lvl>
   </w:abstractNum>
-  <w:abstractNum w:abstractNumId="6" w15:restartNumberingAfterBreak="0">
+  <w:abstractNum w:abstractNumId="10" w15:restartNumberingAfterBreak="0">
+    <w:nsid w:val="1BFC3777"/>
+    <w:multiLevelType w:val="hybridMultilevel"/>
+    <w:tmpl w:val="37B43F28"/>
+    <w:lvl w:ilvl="0" w:tplc="4C09000F">
+      <w:start w:val="1"/>
+      <w:numFmt w:val="decimal"/>
+      <w:lvlText w:val="%1."/>
+      <w:lvlJc w:val="left"/>
+      <w:pPr>
+        <w:ind w:left="720" w:hanging="360"/>
+      </w:pPr>
+      <w:rPr>
+        <w:rFonts w:hint="default"/>
+      </w:rPr>
+    </w:lvl>
+    <w:lvl w:ilvl="1" w:tplc="4C090019" w:tentative="1">
+      <w:start w:val="1"/>
+      <w:numFmt w:val="lowerLetter"/>
+      <w:lvlText w:val="%2."/>
+      <w:lvlJc w:val="left"/>
+      <w:pPr>
+        <w:ind w:left="1440" w:hanging="360"/>
+      </w:pPr>
+    </w:lvl>
+    <w:lvl w:ilvl="2" w:tplc="4C09001B" w:tentative="1">
+      <w:start w:val="1"/>
+      <w:numFmt w:val="lowerRoman"/>
+      <w:lvlText w:val="%3."/>
+      <w:lvlJc w:val="right"/>
+      <w:pPr>
+        <w:ind w:left="2160" w:hanging="180"/>
+      </w:pPr>
+    </w:lvl>
+    <w:lvl w:ilvl="3" w:tplc="4C09000F" w:tentative="1">
+      <w:start w:val="1"/>
+      <w:numFmt w:val="decimal"/>
+      <w:lvlText w:val="%4."/>
+      <w:lvlJc w:val="left"/>
+      <w:pPr>
+        <w:ind w:left="2880" w:hanging="360"/>
+      </w:pPr>
+    </w:lvl>
+    <w:lvl w:ilvl="4" w:tplc="4C090019" w:tentative="1">
+      <w:start w:val="1"/>
+      <w:numFmt w:val="lowerLetter"/>
+      <w:lvlText w:val="%5."/>
+      <w:lvlJc w:val="left"/>
+      <w:pPr>
+        <w:ind w:left="3600" w:hanging="360"/>
+      </w:pPr>
+    </w:lvl>
+    <w:lvl w:ilvl="5" w:tplc="4C09001B" w:tentative="1">
+      <w:start w:val="1"/>
+      <w:numFmt w:val="lowerRoman"/>
+      <w:lvlText w:val="%6."/>
+      <w:lvlJc w:val="right"/>
+      <w:pPr>
+        <w:ind w:left="4320" w:hanging="180"/>
+      </w:pPr>
+    </w:lvl>
+    <w:lvl w:ilvl="6" w:tplc="4C09000F" w:tentative="1">
+      <w:start w:val="1"/>
+      <w:numFmt w:val="decimal"/>
+      <w:lvlText w:val="%7."/>
+      <w:lvlJc w:val="left"/>
+      <w:pPr>
+        <w:ind w:left="5040" w:hanging="360"/>
+      </w:pPr>
+    </w:lvl>
+    <w:lvl w:ilvl="7" w:tplc="4C090019" w:tentative="1">
+      <w:start w:val="1"/>
+      <w:numFmt w:val="lowerLetter"/>
+      <w:lvlText w:val="%8."/>
+      <w:lvlJc w:val="left"/>
+      <w:pPr>
+        <w:ind w:left="5760" w:hanging="360"/>
+      </w:pPr>
+    </w:lvl>
+    <w:lvl w:ilvl="8" w:tplc="4C09001B" w:tentative="1">
+      <w:start w:val="1"/>
+      <w:numFmt w:val="lowerRoman"/>
+      <w:lvlText w:val="%9."/>
+      <w:lvlJc w:val="right"/>
+      <w:pPr>
+        <w:ind w:left="6480" w:hanging="180"/>
+      </w:pPr>
+    </w:lvl>
+  </w:abstractNum>
+  <w:abstractNum w:abstractNumId="11" w15:restartNumberingAfterBreak="0">
+    <w:nsid w:val="1CCA323D"/>
+    <w:multiLevelType w:val="hybridMultilevel"/>
+    <w:tmpl w:val="936616A8"/>
+    <w:lvl w:ilvl="0" w:tplc="4C09000F">
+      <w:start w:val="1"/>
+      <w:numFmt w:val="decimal"/>
+      <w:lvlText w:val="%1."/>
+      <w:lvlJc w:val="left"/>
+      <w:pPr>
+        <w:ind w:left="720" w:hanging="360"/>
+      </w:pPr>
+      <w:rPr>
+        <w:rFonts w:hint="default"/>
+      </w:rPr>
+    </w:lvl>
+    <w:lvl w:ilvl="1" w:tplc="4C090019" w:tentative="1">
+      <w:start w:val="1"/>
+      <w:numFmt w:val="lowerLetter"/>
+      <w:lvlText w:val="%2."/>
+      <w:lvlJc w:val="left"/>
+      <w:pPr>
+        <w:ind w:left="1440" w:hanging="360"/>
+      </w:pPr>
+    </w:lvl>
+    <w:lvl w:ilvl="2" w:tplc="4C09001B" w:tentative="1">
+      <w:start w:val="1"/>
+      <w:numFmt w:val="lowerRoman"/>
+      <w:lvlText w:val="%3."/>
+      <w:lvlJc w:val="right"/>
+      <w:pPr>
+        <w:ind w:left="2160" w:hanging="180"/>
+      </w:pPr>
+    </w:lvl>
+    <w:lvl w:ilvl="3" w:tplc="4C09000F" w:tentative="1">
+      <w:start w:val="1"/>
+      <w:numFmt w:val="decimal"/>
+      <w:lvlText w:val="%4."/>
+      <w:lvlJc w:val="left"/>
+      <w:pPr>
+        <w:ind w:left="2880" w:hanging="360"/>
+      </w:pPr>
+    </w:lvl>
+    <w:lvl w:ilvl="4" w:tplc="4C090019" w:tentative="1">
+      <w:start w:val="1"/>
+      <w:numFmt w:val="lowerLetter"/>
+      <w:lvlText w:val="%5."/>
+      <w:lvlJc w:val="left"/>
+      <w:pPr>
+        <w:ind w:left="3600" w:hanging="360"/>
+      </w:pPr>
+    </w:lvl>
+    <w:lvl w:ilvl="5" w:tplc="4C09001B" w:tentative="1">
+      <w:start w:val="1"/>
+      <w:numFmt w:val="lowerRoman"/>
+      <w:lvlText w:val="%6."/>
+      <w:lvlJc w:val="right"/>
+      <w:pPr>
+        <w:ind w:left="4320" w:hanging="180"/>
+      </w:pPr>
+    </w:lvl>
+    <w:lvl w:ilvl="6" w:tplc="4C09000F" w:tentative="1">
+      <w:start w:val="1"/>
+      <w:numFmt w:val="decimal"/>
+      <w:lvlText w:val="%7."/>
+      <w:lvlJc w:val="left"/>
+      <w:pPr>
+        <w:ind w:left="5040" w:hanging="360"/>
+      </w:pPr>
+    </w:lvl>
+    <w:lvl w:ilvl="7" w:tplc="4C090019" w:tentative="1">
+      <w:start w:val="1"/>
+      <w:numFmt w:val="lowerLetter"/>
+      <w:lvlText w:val="%8."/>
+      <w:lvlJc w:val="left"/>
+      <w:pPr>
+        <w:ind w:left="5760" w:hanging="360"/>
+      </w:pPr>
+    </w:lvl>
+    <w:lvl w:ilvl="8" w:tplc="4C09001B" w:tentative="1">
+      <w:start w:val="1"/>
+      <w:numFmt w:val="lowerRoman"/>
+      <w:lvlText w:val="%9."/>
+      <w:lvlJc w:val="right"/>
+      <w:pPr>
+        <w:ind w:left="6480" w:hanging="180"/>
+      </w:pPr>
+    </w:lvl>
+  </w:abstractNum>
+  <w:abstractNum w:abstractNumId="12" w15:restartNumberingAfterBreak="0">
     <w:nsid w:val="1EAE320D"/>
     <w:multiLevelType w:val="hybridMultilevel"/>
     <w:tmpl w:val="953A80FC"/>
@@ -3306,7 +4977,185 @@
       </w:rPr>
     </w:lvl>
   </w:abstractNum>
-  <w:abstractNum w:abstractNumId="7" w15:restartNumberingAfterBreak="0">
+  <w:abstractNum w:abstractNumId="13" w15:restartNumberingAfterBreak="0">
+    <w:nsid w:val="20B32E51"/>
+    <w:multiLevelType w:val="hybridMultilevel"/>
+    <w:tmpl w:val="B5B0C23A"/>
+    <w:lvl w:ilvl="0" w:tplc="4C09000F">
+      <w:start w:val="1"/>
+      <w:numFmt w:val="decimal"/>
+      <w:lvlText w:val="%1."/>
+      <w:lvlJc w:val="left"/>
+      <w:pPr>
+        <w:ind w:left="720" w:hanging="360"/>
+      </w:pPr>
+      <w:rPr>
+        <w:rFonts w:hint="default"/>
+      </w:rPr>
+    </w:lvl>
+    <w:lvl w:ilvl="1" w:tplc="4C090019" w:tentative="1">
+      <w:start w:val="1"/>
+      <w:numFmt w:val="lowerLetter"/>
+      <w:lvlText w:val="%2."/>
+      <w:lvlJc w:val="left"/>
+      <w:pPr>
+        <w:ind w:left="1440" w:hanging="360"/>
+      </w:pPr>
+    </w:lvl>
+    <w:lvl w:ilvl="2" w:tplc="4C09001B" w:tentative="1">
+      <w:start w:val="1"/>
+      <w:numFmt w:val="lowerRoman"/>
+      <w:lvlText w:val="%3."/>
+      <w:lvlJc w:val="right"/>
+      <w:pPr>
+        <w:ind w:left="2160" w:hanging="180"/>
+      </w:pPr>
+    </w:lvl>
+    <w:lvl w:ilvl="3" w:tplc="4C09000F" w:tentative="1">
+      <w:start w:val="1"/>
+      <w:numFmt w:val="decimal"/>
+      <w:lvlText w:val="%4."/>
+      <w:lvlJc w:val="left"/>
+      <w:pPr>
+        <w:ind w:left="2880" w:hanging="360"/>
+      </w:pPr>
+    </w:lvl>
+    <w:lvl w:ilvl="4" w:tplc="4C090019" w:tentative="1">
+      <w:start w:val="1"/>
+      <w:numFmt w:val="lowerLetter"/>
+      <w:lvlText w:val="%5."/>
+      <w:lvlJc w:val="left"/>
+      <w:pPr>
+        <w:ind w:left="3600" w:hanging="360"/>
+      </w:pPr>
+    </w:lvl>
+    <w:lvl w:ilvl="5" w:tplc="4C09001B" w:tentative="1">
+      <w:start w:val="1"/>
+      <w:numFmt w:val="lowerRoman"/>
+      <w:lvlText w:val="%6."/>
+      <w:lvlJc w:val="right"/>
+      <w:pPr>
+        <w:ind w:left="4320" w:hanging="180"/>
+      </w:pPr>
+    </w:lvl>
+    <w:lvl w:ilvl="6" w:tplc="4C09000F" w:tentative="1">
+      <w:start w:val="1"/>
+      <w:numFmt w:val="decimal"/>
+      <w:lvlText w:val="%7."/>
+      <w:lvlJc w:val="left"/>
+      <w:pPr>
+        <w:ind w:left="5040" w:hanging="360"/>
+      </w:pPr>
+    </w:lvl>
+    <w:lvl w:ilvl="7" w:tplc="4C090019" w:tentative="1">
+      <w:start w:val="1"/>
+      <w:numFmt w:val="lowerLetter"/>
+      <w:lvlText w:val="%8."/>
+      <w:lvlJc w:val="left"/>
+      <w:pPr>
+        <w:ind w:left="5760" w:hanging="360"/>
+      </w:pPr>
+    </w:lvl>
+    <w:lvl w:ilvl="8" w:tplc="4C09001B" w:tentative="1">
+      <w:start w:val="1"/>
+      <w:numFmt w:val="lowerRoman"/>
+      <w:lvlText w:val="%9."/>
+      <w:lvlJc w:val="right"/>
+      <w:pPr>
+        <w:ind w:left="6480" w:hanging="180"/>
+      </w:pPr>
+    </w:lvl>
+  </w:abstractNum>
+  <w:abstractNum w:abstractNumId="14" w15:restartNumberingAfterBreak="0">
+    <w:nsid w:val="27DE3794"/>
+    <w:multiLevelType w:val="hybridMultilevel"/>
+    <w:tmpl w:val="C19AC366"/>
+    <w:lvl w:ilvl="0" w:tplc="4C09000F">
+      <w:start w:val="1"/>
+      <w:numFmt w:val="decimal"/>
+      <w:lvlText w:val="%1."/>
+      <w:lvlJc w:val="left"/>
+      <w:pPr>
+        <w:ind w:left="720" w:hanging="360"/>
+      </w:pPr>
+      <w:rPr>
+        <w:rFonts w:hint="default"/>
+      </w:rPr>
+    </w:lvl>
+    <w:lvl w:ilvl="1" w:tplc="4C090019" w:tentative="1">
+      <w:start w:val="1"/>
+      <w:numFmt w:val="lowerLetter"/>
+      <w:lvlText w:val="%2."/>
+      <w:lvlJc w:val="left"/>
+      <w:pPr>
+        <w:ind w:left="1440" w:hanging="360"/>
+      </w:pPr>
+    </w:lvl>
+    <w:lvl w:ilvl="2" w:tplc="4C09001B" w:tentative="1">
+      <w:start w:val="1"/>
+      <w:numFmt w:val="lowerRoman"/>
+      <w:lvlText w:val="%3."/>
+      <w:lvlJc w:val="right"/>
+      <w:pPr>
+        <w:ind w:left="2160" w:hanging="180"/>
+      </w:pPr>
+    </w:lvl>
+    <w:lvl w:ilvl="3" w:tplc="4C09000F" w:tentative="1">
+      <w:start w:val="1"/>
+      <w:numFmt w:val="decimal"/>
+      <w:lvlText w:val="%4."/>
+      <w:lvlJc w:val="left"/>
+      <w:pPr>
+        <w:ind w:left="2880" w:hanging="360"/>
+      </w:pPr>
+    </w:lvl>
+    <w:lvl w:ilvl="4" w:tplc="4C090019" w:tentative="1">
+      <w:start w:val="1"/>
+      <w:numFmt w:val="lowerLetter"/>
+      <w:lvlText w:val="%5."/>
+      <w:lvlJc w:val="left"/>
+      <w:pPr>
+        <w:ind w:left="3600" w:hanging="360"/>
+      </w:pPr>
+    </w:lvl>
+    <w:lvl w:ilvl="5" w:tplc="4C09001B" w:tentative="1">
+      <w:start w:val="1"/>
+      <w:numFmt w:val="lowerRoman"/>
+      <w:lvlText w:val="%6."/>
+      <w:lvlJc w:val="right"/>
+      <w:pPr>
+        <w:ind w:left="4320" w:hanging="180"/>
+      </w:pPr>
+    </w:lvl>
+    <w:lvl w:ilvl="6" w:tplc="4C09000F" w:tentative="1">
+      <w:start w:val="1"/>
+      <w:numFmt w:val="decimal"/>
+      <w:lvlText w:val="%7."/>
+      <w:lvlJc w:val="left"/>
+      <w:pPr>
+        <w:ind w:left="5040" w:hanging="360"/>
+      </w:pPr>
+    </w:lvl>
+    <w:lvl w:ilvl="7" w:tplc="4C090019" w:tentative="1">
+      <w:start w:val="1"/>
+      <w:numFmt w:val="lowerLetter"/>
+      <w:lvlText w:val="%8."/>
+      <w:lvlJc w:val="left"/>
+      <w:pPr>
+        <w:ind w:left="5760" w:hanging="360"/>
+      </w:pPr>
+    </w:lvl>
+    <w:lvl w:ilvl="8" w:tplc="4C09001B" w:tentative="1">
+      <w:start w:val="1"/>
+      <w:numFmt w:val="lowerRoman"/>
+      <w:lvlText w:val="%9."/>
+      <w:lvlJc w:val="right"/>
+      <w:pPr>
+        <w:ind w:left="6480" w:hanging="180"/>
+      </w:pPr>
+    </w:lvl>
+  </w:abstractNum>
+  <w:abstractNum w:abstractNumId="15" w15:restartNumberingAfterBreak="0">
     <w:nsid w:val="2C8075B1"/>
     <w:multiLevelType w:val="hybridMultilevel"/>
     <w:tmpl w:val="8F3468A4"/>
@@ -3518,7 +5367,120 @@
       </w:rPr>
     </w:lvl>
   </w:abstractNum>
-  <w:abstractNum w:abstractNumId="8" w15:restartNumberingAfterBreak="0">
+  <w:abstractNum w:abstractNumId="16" w15:restartNumberingAfterBreak="0">
+    <w:nsid w:val="2E5F3F09"/>
+    <w:multiLevelType w:val="hybridMultilevel"/>
+    <w:tmpl w:val="D1FAE2A2"/>
+    <w:lvl w:ilvl="0" w:tplc="42FAF1EE">
+      <w:start w:val="1"/>
+      <w:numFmt w:val="bullet"/>
+      <w:lvlText w:val="-"/>
+      <w:lvlJc w:val="left"/>
+      <w:pPr>
+        <w:ind w:left="1080" w:hanging="360"/>
+      </w:pPr>
+      <w:rPr>
+        <w:rFonts w:ascii="Times New Roman" w:eastAsia="Times New Roman" w:hAnsi="Times New Roman" w:cs="Times New Roman" w:hint="default"/>
+      </w:rPr>
+    </w:lvl>
+    <w:lvl w:ilvl="1" w:tplc="4C090003" w:tentative="1">
+      <w:start w:val="1"/>
+      <w:numFmt w:val="bullet"/>
+      <w:lvlText w:val="o"/>
+      <w:lvlJc w:val="left"/>
+      <w:pPr>
+        <w:ind w:left="1800" w:hanging="360"/>
+      </w:pPr>
+      <w:rPr>
+        <w:rFonts w:ascii="Courier New" w:hAnsi="Courier New" w:cs="Courier New" w:hint="default"/>
+      </w:rPr>
+    </w:lvl>
+    <w:lvl w:ilvl="2" w:tplc="4C090005" w:tentative="1">
+      <w:start w:val="1"/>
+      <w:numFmt w:val="bullet"/>
+      <w:lvlText w:val=""/>
+      <w:lvlJc w:val="left"/>
+      <w:pPr>
+        <w:ind w:left="2520" w:hanging="360"/>
+      </w:pPr>
+      <w:rPr>
+        <w:rFonts w:ascii="Wingdings" w:hAnsi="Wingdings" w:hint="default"/>
+      </w:rPr>
+    </w:lvl>
+    <w:lvl w:ilvl="3" w:tplc="4C090001" w:tentative="1">
+      <w:start w:val="1"/>
+      <w:numFmt w:val="bullet"/>
+      <w:lvlText w:val=""/>
+      <w:lvlJc w:val="left"/>
+      <w:pPr>
+        <w:ind w:left="3240" w:hanging="360"/>
+      </w:pPr>
+      <w:rPr>
+        <w:rFonts w:ascii="Symbol" w:hAnsi="Symbol" w:hint="default"/>
+      </w:rPr>
+    </w:lvl>
+    <w:lvl w:ilvl="4" w:tplc="4C090003" w:tentative="1">
+      <w:start w:val="1"/>
+      <w:numFmt w:val="bullet"/>
+      <w:lvlText w:val="o"/>
+      <w:lvlJc w:val="left"/>
+      <w:pPr>
+        <w:ind w:left="3960" w:hanging="360"/>
+      </w:pPr>
+      <w:rPr>
+        <w:rFonts w:ascii="Courier New" w:hAnsi="Courier New" w:cs="Courier New" w:hint="default"/>
+      </w:rPr>
+    </w:lvl>
+    <w:lvl w:ilvl="5" w:tplc="4C090005" w:tentative="1">
+      <w:start w:val="1"/>
+      <w:numFmt w:val="bullet"/>
+      <w:lvlText w:val=""/>
+      <w:lvlJc w:val="left"/>
+      <w:pPr>
+        <w:ind w:left="4680" w:hanging="360"/>
+      </w:pPr>
+      <w:rPr>
+        <w:rFonts w:ascii="Wingdings" w:hAnsi="Wingdings" w:hint="default"/>
+      </w:rPr>
+    </w:lvl>
+    <w:lvl w:ilvl="6" w:tplc="4C090001" w:tentative="1">
+      <w:start w:val="1"/>
+      <w:numFmt w:val="bullet"/>
+      <w:lvlText w:val=""/>
+      <w:lvlJc w:val="left"/>
+      <w:pPr>
+        <w:ind w:left="5400" w:hanging="360"/>
+      </w:pPr>
+      <w:rPr>
+        <w:rFonts w:ascii="Symbol" w:hAnsi="Symbol" w:hint="default"/>
+      </w:rPr>
+    </w:lvl>
+    <w:lvl w:ilvl="7" w:tplc="4C090003" w:tentative="1">
+      <w:start w:val="1"/>
+      <w:numFmt w:val="bullet"/>
+      <w:lvlText w:val="o"/>
+      <w:lvlJc w:val="left"/>
+      <w:pPr>
+        <w:ind w:left="6120" w:hanging="360"/>
+      </w:pPr>
+      <w:rPr>
+        <w:rFonts w:ascii="Courier New" w:hAnsi="Courier New" w:cs="Courier New" w:hint="default"/>
+      </w:rPr>
+    </w:lvl>
+    <w:lvl w:ilvl="8" w:tplc="4C090005" w:tentative="1">
+      <w:start w:val="1"/>
+      <w:numFmt w:val="bullet"/>
+      <w:lvlText w:val=""/>
+      <w:lvlJc w:val="left"/>
+      <w:pPr>
+        <w:ind w:left="6840" w:hanging="360"/>
+      </w:pPr>
+      <w:rPr>
+        <w:rFonts w:ascii="Wingdings" w:hAnsi="Wingdings" w:hint="default"/>
+      </w:rPr>
+    </w:lvl>
+  </w:abstractNum>
+  <w:abstractNum w:abstractNumId="17" w15:restartNumberingAfterBreak="0">
     <w:nsid w:val="38042FEB"/>
     <w:multiLevelType w:val="hybridMultilevel"/>
     <w:tmpl w:val="3EDE3B02"/>
@@ -3730,7 +5692,7 @@
       </w:rPr>
     </w:lvl>
   </w:abstractNum>
-  <w:abstractNum w:abstractNumId="9" w15:restartNumberingAfterBreak="0">
+  <w:abstractNum w:abstractNumId="18" w15:restartNumberingAfterBreak="0">
     <w:nsid w:val="38A544B9"/>
     <w:multiLevelType w:val="hybridMultilevel"/>
     <w:tmpl w:val="812AAD8A"/>
@@ -3843,7 +5805,7 @@
       </w:rPr>
     </w:lvl>
   </w:abstractNum>
-  <w:abstractNum w:abstractNumId="10" w15:restartNumberingAfterBreak="0">
+  <w:abstractNum w:abstractNumId="19" w15:restartNumberingAfterBreak="0">
     <w:nsid w:val="3BF15C19"/>
     <w:multiLevelType w:val="hybridMultilevel"/>
     <w:tmpl w:val="5D505E6C"/>
@@ -4056,7 +6018,185 @@
       </w:rPr>
     </w:lvl>
   </w:abstractNum>
-  <w:abstractNum w:abstractNumId="11" w15:restartNumberingAfterBreak="0">
+  <w:abstractNum w:abstractNumId="20" w15:restartNumberingAfterBreak="0">
+    <w:nsid w:val="41256E49"/>
+    <w:multiLevelType w:val="hybridMultilevel"/>
+    <w:tmpl w:val="4286A50E"/>
+    <w:lvl w:ilvl="0" w:tplc="4C09000F">
+      <w:start w:val="1"/>
+      <w:numFmt w:val="decimal"/>
+      <w:lvlText w:val="%1."/>
+      <w:lvlJc w:val="left"/>
+      <w:pPr>
+        <w:ind w:left="720" w:hanging="360"/>
+      </w:pPr>
+      <w:rPr>
+        <w:rFonts w:hint="default"/>
+      </w:rPr>
+    </w:lvl>
+    <w:lvl w:ilvl="1" w:tplc="4C090019" w:tentative="1">
+      <w:start w:val="1"/>
+      <w:numFmt w:val="lowerLetter"/>
+      <w:lvlText w:val="%2."/>
+      <w:lvlJc w:val="left"/>
+      <w:pPr>
+        <w:ind w:left="1440" w:hanging="360"/>
+      </w:pPr>
+    </w:lvl>
+    <w:lvl w:ilvl="2" w:tplc="4C09001B" w:tentative="1">
+      <w:start w:val="1"/>
+      <w:numFmt w:val="lowerRoman"/>
+      <w:lvlText w:val="%3."/>
+      <w:lvlJc w:val="right"/>
+      <w:pPr>
+        <w:ind w:left="2160" w:hanging="180"/>
+      </w:pPr>
+    </w:lvl>
+    <w:lvl w:ilvl="3" w:tplc="4C09000F" w:tentative="1">
+      <w:start w:val="1"/>
+      <w:numFmt w:val="decimal"/>
+      <w:lvlText w:val="%4."/>
+      <w:lvlJc w:val="left"/>
+      <w:pPr>
+        <w:ind w:left="2880" w:hanging="360"/>
+      </w:pPr>
+    </w:lvl>
+    <w:lvl w:ilvl="4" w:tplc="4C090019" w:tentative="1">
+      <w:start w:val="1"/>
+      <w:numFmt w:val="lowerLetter"/>
+      <w:lvlText w:val="%5."/>
+      <w:lvlJc w:val="left"/>
+      <w:pPr>
+        <w:ind w:left="3600" w:hanging="360"/>
+      </w:pPr>
+    </w:lvl>
+    <w:lvl w:ilvl="5" w:tplc="4C09001B" w:tentative="1">
+      <w:start w:val="1"/>
+      <w:numFmt w:val="lowerRoman"/>
+      <w:lvlText w:val="%6."/>
+      <w:lvlJc w:val="right"/>
+      <w:pPr>
+        <w:ind w:left="4320" w:hanging="180"/>
+      </w:pPr>
+    </w:lvl>
+    <w:lvl w:ilvl="6" w:tplc="4C09000F" w:tentative="1">
+      <w:start w:val="1"/>
+      <w:numFmt w:val="decimal"/>
+      <w:lvlText w:val="%7."/>
+      <w:lvlJc w:val="left"/>
+      <w:pPr>
+        <w:ind w:left="5040" w:hanging="360"/>
+      </w:pPr>
+    </w:lvl>
+    <w:lvl w:ilvl="7" w:tplc="4C090019" w:tentative="1">
+      <w:start w:val="1"/>
+      <w:numFmt w:val="lowerLetter"/>
+      <w:lvlText w:val="%8."/>
+      <w:lvlJc w:val="left"/>
+      <w:pPr>
+        <w:ind w:left="5760" w:hanging="360"/>
+      </w:pPr>
+    </w:lvl>
+    <w:lvl w:ilvl="8" w:tplc="4C09001B" w:tentative="1">
+      <w:start w:val="1"/>
+      <w:numFmt w:val="lowerRoman"/>
+      <w:lvlText w:val="%9."/>
+      <w:lvlJc w:val="right"/>
+      <w:pPr>
+        <w:ind w:left="6480" w:hanging="180"/>
+      </w:pPr>
+    </w:lvl>
+  </w:abstractNum>
+  <w:abstractNum w:abstractNumId="21" w15:restartNumberingAfterBreak="0">
+    <w:nsid w:val="43985F38"/>
+    <w:multiLevelType w:val="hybridMultilevel"/>
+    <w:tmpl w:val="159201A8"/>
+    <w:lvl w:ilvl="0" w:tplc="4C09000F">
+      <w:start w:val="1"/>
+      <w:numFmt w:val="decimal"/>
+      <w:lvlText w:val="%1."/>
+      <w:lvlJc w:val="left"/>
+      <w:pPr>
+        <w:ind w:left="720" w:hanging="360"/>
+      </w:pPr>
+      <w:rPr>
+        <w:rFonts w:hint="default"/>
+      </w:rPr>
+    </w:lvl>
+    <w:lvl w:ilvl="1" w:tplc="4C090019" w:tentative="1">
+      <w:start w:val="1"/>
+      <w:numFmt w:val="lowerLetter"/>
+      <w:lvlText w:val="%2."/>
+      <w:lvlJc w:val="left"/>
+      <w:pPr>
+        <w:ind w:left="1440" w:hanging="360"/>
+      </w:pPr>
+    </w:lvl>
+    <w:lvl w:ilvl="2" w:tplc="4C09001B" w:tentative="1">
+      <w:start w:val="1"/>
+      <w:numFmt w:val="lowerRoman"/>
+      <w:lvlText w:val="%3."/>
+      <w:lvlJc w:val="right"/>
+      <w:pPr>
+        <w:ind w:left="2160" w:hanging="180"/>
+      </w:pPr>
+    </w:lvl>
+    <w:lvl w:ilvl="3" w:tplc="4C09000F" w:tentative="1">
+      <w:start w:val="1"/>
+      <w:numFmt w:val="decimal"/>
+      <w:lvlText w:val="%4."/>
+      <w:lvlJc w:val="left"/>
+      <w:pPr>
+        <w:ind w:left="2880" w:hanging="360"/>
+      </w:pPr>
+    </w:lvl>
+    <w:lvl w:ilvl="4" w:tplc="4C090019" w:tentative="1">
+      <w:start w:val="1"/>
+      <w:numFmt w:val="lowerLetter"/>
+      <w:lvlText w:val="%5."/>
+      <w:lvlJc w:val="left"/>
+      <w:pPr>
+        <w:ind w:left="3600" w:hanging="360"/>
+      </w:pPr>
+    </w:lvl>
+    <w:lvl w:ilvl="5" w:tplc="4C09001B" w:tentative="1">
+      <w:start w:val="1"/>
+      <w:numFmt w:val="lowerRoman"/>
+      <w:lvlText w:val="%6."/>
+      <w:lvlJc w:val="right"/>
+      <w:pPr>
+        <w:ind w:left="4320" w:hanging="180"/>
+      </w:pPr>
+    </w:lvl>
+    <w:lvl w:ilvl="6" w:tplc="4C09000F" w:tentative="1">
+      <w:start w:val="1"/>
+      <w:numFmt w:val="decimal"/>
+      <w:lvlText w:val="%7."/>
+      <w:lvlJc w:val="left"/>
+      <w:pPr>
+        <w:ind w:left="5040" w:hanging="360"/>
+      </w:pPr>
+    </w:lvl>
+    <w:lvl w:ilvl="7" w:tplc="4C090019" w:tentative="1">
+      <w:start w:val="1"/>
+      <w:numFmt w:val="lowerLetter"/>
+      <w:lvlText w:val="%8."/>
+      <w:lvlJc w:val="left"/>
+      <w:pPr>
+        <w:ind w:left="5760" w:hanging="360"/>
+      </w:pPr>
+    </w:lvl>
+    <w:lvl w:ilvl="8" w:tplc="4C09001B" w:tentative="1">
+      <w:start w:val="1"/>
+      <w:numFmt w:val="lowerRoman"/>
+      <w:lvlText w:val="%9."/>
+      <w:lvlJc w:val="right"/>
+      <w:pPr>
+        <w:ind w:left="6480" w:hanging="180"/>
+      </w:pPr>
+    </w:lvl>
+  </w:abstractNum>
+  <w:abstractNum w:abstractNumId="22" w15:restartNumberingAfterBreak="0">
     <w:nsid w:val="4E4A3EE1"/>
     <w:multiLevelType w:val="hybridMultilevel"/>
     <w:tmpl w:val="E0884A78"/>
@@ -4268,7 +6408,7 @@
       </w:rPr>
     </w:lvl>
   </w:abstractNum>
-  <w:abstractNum w:abstractNumId="12" w15:restartNumberingAfterBreak="0">
+  <w:abstractNum w:abstractNumId="23" w15:restartNumberingAfterBreak="0">
     <w:nsid w:val="517F3E53"/>
     <w:multiLevelType w:val="hybridMultilevel"/>
     <w:tmpl w:val="72582338"/>
@@ -4480,7 +6620,209 @@
       </w:rPr>
     </w:lvl>
   </w:abstractNum>
-  <w:abstractNum w:abstractNumId="13" w15:restartNumberingAfterBreak="0">
+  <w:abstractNum w:abstractNumId="24" w15:restartNumberingAfterBreak="0">
+    <w:nsid w:val="59B82EC5"/>
+    <w:multiLevelType w:val="hybridMultilevel"/>
+    <w:tmpl w:val="0D4680FA"/>
+    <w:lvl w:ilvl="0" w:tplc="4C09000F">
+      <w:start w:val="1"/>
+      <w:numFmt w:val="decimal"/>
+      <w:lvlText w:val="%1."/>
+      <w:lvlJc w:val="left"/>
+      <w:pPr>
+        <w:ind w:left="720" w:hanging="360"/>
+      </w:pPr>
+      <w:rPr>
+        <w:rFonts w:hint="default"/>
+      </w:rPr>
+    </w:lvl>
+    <w:lvl w:ilvl="1" w:tplc="4C090019" w:tentative="1">
+      <w:start w:val="1"/>
+      <w:numFmt w:val="lowerLetter"/>
+      <w:lvlText w:val="%2."/>
+      <w:lvlJc w:val="left"/>
+      <w:pPr>
+        <w:ind w:left="1440" w:hanging="360"/>
+      </w:pPr>
+    </w:lvl>
+    <w:lvl w:ilvl="2" w:tplc="4C09001B" w:tentative="1">
+      <w:start w:val="1"/>
+      <w:numFmt w:val="lowerRoman"/>
+      <w:lvlText w:val="%3."/>
+      <w:lvlJc w:val="right"/>
+      <w:pPr>
+        <w:ind w:left="2160" w:hanging="180"/>
+      </w:pPr>
+    </w:lvl>
+    <w:lvl w:ilvl="3" w:tplc="4C09000F" w:tentative="1">
+      <w:start w:val="1"/>
+      <w:numFmt w:val="decimal"/>
+      <w:lvlText w:val="%4."/>
+      <w:lvlJc w:val="left"/>
+      <w:pPr>
+        <w:ind w:left="2880" w:hanging="360"/>
+      </w:pPr>
+    </w:lvl>
+    <w:lvl w:ilvl="4" w:tplc="4C090019" w:tentative="1">
+      <w:start w:val="1"/>
+      <w:numFmt w:val="lowerLetter"/>
+      <w:lvlText w:val="%5."/>
+      <w:lvlJc w:val="left"/>
+      <w:pPr>
+        <w:ind w:left="3600" w:hanging="360"/>
+      </w:pPr>
+    </w:lvl>
+    <w:lvl w:ilvl="5" w:tplc="4C09001B" w:tentative="1">
+      <w:start w:val="1"/>
+      <w:numFmt w:val="lowerRoman"/>
+      <w:lvlText w:val="%6."/>
+      <w:lvlJc w:val="right"/>
+      <w:pPr>
+        <w:ind w:left="4320" w:hanging="180"/>
+      </w:pPr>
+    </w:lvl>
+    <w:lvl w:ilvl="6" w:tplc="4C09000F" w:tentative="1">
+      <w:start w:val="1"/>
+      <w:numFmt w:val="decimal"/>
+      <w:lvlText w:val="%7."/>
+      <w:lvlJc w:val="left"/>
+      <w:pPr>
+        <w:ind w:left="5040" w:hanging="360"/>
+      </w:pPr>
+    </w:lvl>
+    <w:lvl w:ilvl="7" w:tplc="4C090019" w:tentative="1">
+      <w:start w:val="1"/>
+      <w:numFmt w:val="lowerLetter"/>
+      <w:lvlText w:val="%8."/>
+      <w:lvlJc w:val="left"/>
+      <w:pPr>
+        <w:ind w:left="5760" w:hanging="360"/>
+      </w:pPr>
+    </w:lvl>
+    <w:lvl w:ilvl="8" w:tplc="4C09001B" w:tentative="1">
+      <w:start w:val="1"/>
+      <w:numFmt w:val="lowerRoman"/>
+      <w:lvlText w:val="%9."/>
+      <w:lvlJc w:val="right"/>
+      <w:pPr>
+        <w:ind w:left="6480" w:hanging="180"/>
+      </w:pPr>
+    </w:lvl>
+  </w:abstractNum>
+  <w:abstractNum w:abstractNumId="25" w15:restartNumberingAfterBreak="0">
+    <w:nsid w:val="6A115232"/>
+    <w:multiLevelType w:val="hybridMultilevel"/>
+    <w:tmpl w:val="2794D3DE"/>
+    <w:lvl w:ilvl="0" w:tplc="26C8399A">
+      <w:start w:val="1"/>
+      <w:numFmt w:val="bullet"/>
+      <w:lvlText w:val="-"/>
+      <w:lvlJc w:val="left"/>
+      <w:pPr>
+        <w:ind w:left="720" w:hanging="360"/>
+      </w:pPr>
+      <w:rPr>
+        <w:rFonts w:ascii="Times New Roman" w:eastAsia="Times New Roman" w:hAnsi="Times New Roman" w:cs="Times New Roman" w:hint="default"/>
+      </w:rPr>
+    </w:lvl>
+    <w:lvl w:ilvl="1" w:tplc="4C090003" w:tentative="1">
+      <w:start w:val="1"/>
+      <w:numFmt w:val="bullet"/>
+      <w:lvlText w:val="o"/>
+      <w:lvlJc w:val="left"/>
+      <w:pPr>
+        <w:ind w:left="1440" w:hanging="360"/>
+      </w:pPr>
+      <w:rPr>
+        <w:rFonts w:ascii="Courier New" w:hAnsi="Courier New" w:cs="Courier New" w:hint="default"/>
+      </w:rPr>
+    </w:lvl>
+    <w:lvl w:ilvl="2" w:tplc="4C090005" w:tentative="1">
+      <w:start w:val="1"/>
+      <w:numFmt w:val="bullet"/>
+      <w:lvlText w:val=""/>
+      <w:lvlJc w:val="left"/>
+      <w:pPr>
+        <w:ind w:left="2160" w:hanging="360"/>
+      </w:pPr>
+      <w:rPr>
+        <w:rFonts w:ascii="Wingdings" w:hAnsi="Wingdings" w:hint="default"/>
+      </w:rPr>
+    </w:lvl>
+    <w:lvl w:ilvl="3" w:tplc="4C090001" w:tentative="1">
+      <w:start w:val="1"/>
+      <w:numFmt w:val="bullet"/>
+      <w:lvlText w:val=""/>
+      <w:lvlJc w:val="left"/>
+      <w:pPr>
+        <w:ind w:left="2880" w:hanging="360"/>
+      </w:pPr>
+      <w:rPr>
+        <w:rFonts w:ascii="Symbol" w:hAnsi="Symbol" w:hint="default"/>
+      </w:rPr>
+    </w:lvl>
+    <w:lvl w:ilvl="4" w:tplc="4C090003" w:tentative="1">
+      <w:start w:val="1"/>
+      <w:numFmt w:val="bullet"/>
+      <w:lvlText w:val="o"/>
+      <w:lvlJc w:val="left"/>
+      <w:pPr>
+        <w:ind w:left="3600" w:hanging="360"/>
+      </w:pPr>
+      <w:rPr>
+        <w:rFonts w:ascii="Courier New" w:hAnsi="Courier New" w:cs="Courier New" w:hint="default"/>
+      </w:rPr>
+    </w:lvl>
+    <w:lvl w:ilvl="5" w:tplc="4C090005" w:tentative="1">
+      <w:start w:val="1"/>
+      <w:numFmt w:val="bullet"/>
+      <w:lvlText w:val=""/>
+      <w:lvlJc w:val="left"/>
+      <w:pPr>
+        <w:ind w:left="4320" w:hanging="360"/>
+      </w:pPr>
+      <w:rPr>
+        <w:rFonts w:ascii="Wingdings" w:hAnsi="Wingdings" w:hint="default"/>
+      </w:rPr>
+    </w:lvl>
+    <w:lvl w:ilvl="6" w:tplc="4C090001" w:tentative="1">
+      <w:start w:val="1"/>
+      <w:numFmt w:val="bullet"/>
+      <w:lvlText w:val=""/>
+      <w:lvlJc w:val="left"/>
+      <w:pPr>
+        <w:ind w:left="5040" w:hanging="360"/>
+      </w:pPr>
+      <w:rPr>
+        <w:rFonts w:ascii="Symbol" w:hAnsi="Symbol" w:hint="default"/>
+      </w:rPr>
+    </w:lvl>
+    <w:lvl w:ilvl="7" w:tplc="4C090003" w:tentative="1">
+      <w:start w:val="1"/>
+      <w:numFmt w:val="bullet"/>
+      <w:lvlText w:val="o"/>
+      <w:lvlJc w:val="left"/>
+      <w:pPr>
+        <w:ind w:left="5760" w:hanging="360"/>
+      </w:pPr>
+      <w:rPr>
+        <w:rFonts w:ascii="Courier New" w:hAnsi="Courier New" w:cs="Courier New" w:hint="default"/>
+      </w:rPr>
+    </w:lvl>
+    <w:lvl w:ilvl="8" w:tplc="4C090005" w:tentative="1">
+      <w:start w:val="1"/>
+      <w:numFmt w:val="bullet"/>
+      <w:lvlText w:val=""/>
+      <w:lvlJc w:val="left"/>
+      <w:pPr>
+        <w:ind w:left="6480" w:hanging="360"/>
+      </w:pPr>
+      <w:rPr>
+        <w:rFonts w:ascii="Wingdings" w:hAnsi="Wingdings" w:hint="default"/>
+      </w:rPr>
+    </w:lvl>
+  </w:abstractNum>
+  <w:abstractNum w:abstractNumId="26" w15:restartNumberingAfterBreak="0">
     <w:nsid w:val="6AA16187"/>
     <w:multiLevelType w:val="hybridMultilevel"/>
     <w:tmpl w:val="8FFE6A4E"/>
@@ -4692,7 +7034,7 @@
       </w:rPr>
     </w:lvl>
   </w:abstractNum>
-  <w:abstractNum w:abstractNumId="14" w15:restartNumberingAfterBreak="0">
+  <w:abstractNum w:abstractNumId="27" w15:restartNumberingAfterBreak="0">
     <w:nsid w:val="6E590D72"/>
     <w:multiLevelType w:val="hybridMultilevel"/>
     <w:tmpl w:val="DECCCDEE"/>
@@ -4904,50 +7246,181 @@
       </w:rPr>
     </w:lvl>
   </w:abstractNum>
+  <w:abstractNum w:abstractNumId="28" w15:restartNumberingAfterBreak="0">
+    <w:nsid w:val="7FAB2528"/>
+    <w:multiLevelType w:val="hybridMultilevel"/>
+    <w:tmpl w:val="A5D8C17E"/>
+    <w:lvl w:ilvl="0" w:tplc="4C09000F">
+      <w:start w:val="1"/>
+      <w:numFmt w:val="decimal"/>
+      <w:lvlText w:val="%1."/>
+      <w:lvlJc w:val="left"/>
+      <w:pPr>
+        <w:ind w:left="720" w:hanging="360"/>
+      </w:pPr>
+      <w:rPr>
+        <w:rFonts w:hint="default"/>
+      </w:rPr>
+    </w:lvl>
+    <w:lvl w:ilvl="1" w:tplc="4C090019" w:tentative="1">
+      <w:start w:val="1"/>
+      <w:numFmt w:val="lowerLetter"/>
+      <w:lvlText w:val="%2."/>
+      <w:lvlJc w:val="left"/>
+      <w:pPr>
+        <w:ind w:left="1440" w:hanging="360"/>
+      </w:pPr>
+    </w:lvl>
+    <w:lvl w:ilvl="2" w:tplc="4C09001B" w:tentative="1">
+      <w:start w:val="1"/>
+      <w:numFmt w:val="lowerRoman"/>
+      <w:lvlText w:val="%3."/>
+      <w:lvlJc w:val="right"/>
+      <w:pPr>
+        <w:ind w:left="2160" w:hanging="180"/>
+      </w:pPr>
+    </w:lvl>
+    <w:lvl w:ilvl="3" w:tplc="4C09000F" w:tentative="1">
+      <w:start w:val="1"/>
+      <w:numFmt w:val="decimal"/>
+      <w:lvlText w:val="%4."/>
+      <w:lvlJc w:val="left"/>
+      <w:pPr>
+        <w:ind w:left="2880" w:hanging="360"/>
+      </w:pPr>
+    </w:lvl>
+    <w:lvl w:ilvl="4" w:tplc="4C090019" w:tentative="1">
+      <w:start w:val="1"/>
+      <w:numFmt w:val="lowerLetter"/>
+      <w:lvlText w:val="%5."/>
+      <w:lvlJc w:val="left"/>
+      <w:pPr>
+        <w:ind w:left="3600" w:hanging="360"/>
+      </w:pPr>
+    </w:lvl>
+    <w:lvl w:ilvl="5" w:tplc="4C09001B" w:tentative="1">
+      <w:start w:val="1"/>
+      <w:numFmt w:val="lowerRoman"/>
+      <w:lvlText w:val="%6."/>
+      <w:lvlJc w:val="right"/>
+      <w:pPr>
+        <w:ind w:left="4320" w:hanging="180"/>
+      </w:pPr>
+    </w:lvl>
+    <w:lvl w:ilvl="6" w:tplc="4C09000F" w:tentative="1">
+      <w:start w:val="1"/>
+      <w:numFmt w:val="decimal"/>
+      <w:lvlText w:val="%7."/>
+      <w:lvlJc w:val="left"/>
+      <w:pPr>
+        <w:ind w:left="5040" w:hanging="360"/>
+      </w:pPr>
+    </w:lvl>
+    <w:lvl w:ilvl="7" w:tplc="4C090019" w:tentative="1">
+      <w:start w:val="1"/>
+      <w:numFmt w:val="lowerLetter"/>
+      <w:lvlText w:val="%8."/>
+      <w:lvlJc w:val="left"/>
+      <w:pPr>
+        <w:ind w:left="5760" w:hanging="360"/>
+      </w:pPr>
+    </w:lvl>
+    <w:lvl w:ilvl="8" w:tplc="4C09001B" w:tentative="1">
+      <w:start w:val="1"/>
+      <w:numFmt w:val="lowerRoman"/>
+      <w:lvlText w:val="%9."/>
+      <w:lvlJc w:val="right"/>
+      <w:pPr>
+        <w:ind w:left="6480" w:hanging="180"/>
+      </w:pPr>
+    </w:lvl>
+  </w:abstractNum>
   <w:num w:numId="1" w16cid:durableId="443115175">
+    <w:abstractNumId w:val="19"/>
+  </w:num>
+  <w:num w:numId="2" w16cid:durableId="1914049367">
+    <w:abstractNumId w:val="22"/>
+  </w:num>
+  <w:num w:numId="3" w16cid:durableId="387844133">
+    <w:abstractNumId w:val="2"/>
+  </w:num>
+  <w:num w:numId="4" w16cid:durableId="2048677873">
+    <w:abstractNumId w:val="3"/>
+  </w:num>
+  <w:num w:numId="5" w16cid:durableId="2019842228">
+    <w:abstractNumId w:val="15"/>
+  </w:num>
+  <w:num w:numId="6" w16cid:durableId="1450590981">
+    <w:abstractNumId w:val="26"/>
+  </w:num>
+  <w:num w:numId="7" w16cid:durableId="1887058491">
+    <w:abstractNumId w:val="5"/>
+  </w:num>
+  <w:num w:numId="8" w16cid:durableId="1183320076">
+    <w:abstractNumId w:val="9"/>
+  </w:num>
+  <w:num w:numId="9" w16cid:durableId="449206480">
+    <w:abstractNumId w:val="8"/>
+  </w:num>
+  <w:num w:numId="10" w16cid:durableId="1589541016">
+    <w:abstractNumId w:val="1"/>
+  </w:num>
+  <w:num w:numId="11" w16cid:durableId="1493259220">
+    <w:abstractNumId w:val="27"/>
+  </w:num>
+  <w:num w:numId="12" w16cid:durableId="1109355992">
+    <w:abstractNumId w:val="23"/>
+  </w:num>
+  <w:num w:numId="13" w16cid:durableId="634530465">
+    <w:abstractNumId w:val="12"/>
+  </w:num>
+  <w:num w:numId="14" w16cid:durableId="29503805">
+    <w:abstractNumId w:val="17"/>
+  </w:num>
+  <w:num w:numId="15" w16cid:durableId="110370365">
+    <w:abstractNumId w:val="18"/>
+  </w:num>
+  <w:num w:numId="16" w16cid:durableId="174226716">
+    <w:abstractNumId w:val="14"/>
+  </w:num>
+  <w:num w:numId="17" w16cid:durableId="1303341712">
+    <w:abstractNumId w:val="0"/>
+  </w:num>
+  <w:num w:numId="18" w16cid:durableId="1961064800">
+    <w:abstractNumId w:val="20"/>
+  </w:num>
+  <w:num w:numId="19" w16cid:durableId="300963008">
+    <w:abstractNumId w:val="7"/>
+  </w:num>
+  <w:num w:numId="20" w16cid:durableId="2112622489">
+    <w:abstractNumId w:val="21"/>
+  </w:num>
+  <w:num w:numId="21" w16cid:durableId="1704015609">
     <w:abstractNumId w:val="10"/>
   </w:num>
-  <w:num w:numId="2" w16cid:durableId="1914049367">
+  <w:num w:numId="22" w16cid:durableId="727343120">
+    <w:abstractNumId w:val="16"/>
+  </w:num>
+  <w:num w:numId="23" w16cid:durableId="727802766">
+    <w:abstractNumId w:val="25"/>
+  </w:num>
+  <w:num w:numId="24" w16cid:durableId="893933443">
+    <w:abstractNumId w:val="6"/>
+  </w:num>
+  <w:num w:numId="25" w16cid:durableId="269357106">
+    <w:abstractNumId w:val="24"/>
+  </w:num>
+  <w:num w:numId="26" w16cid:durableId="1376545731">
+    <w:abstractNumId w:val="13"/>
+  </w:num>
+  <w:num w:numId="27" w16cid:durableId="1907295760">
+    <w:abstractNumId w:val="28"/>
+  </w:num>
+  <w:num w:numId="28" w16cid:durableId="620306098">
     <w:abstractNumId w:val="11"/>
   </w:num>
-  <w:num w:numId="3" w16cid:durableId="387844133">
-    <w:abstractNumId w:val="1"/>
-  </w:num>
-  <w:num w:numId="4" w16cid:durableId="2048677873">
-    <w:abstractNumId w:val="2"/>
-  </w:num>
-  <w:num w:numId="5" w16cid:durableId="2019842228">
-    <w:abstractNumId w:val="7"/>
-  </w:num>
-  <w:num w:numId="6" w16cid:durableId="1450590981">
-    <w:abstractNumId w:val="13"/>
-  </w:num>
-  <w:num w:numId="7" w16cid:durableId="1887058491">
-    <w:abstractNumId w:val="3"/>
-  </w:num>
-  <w:num w:numId="8" w16cid:durableId="1183320076">
-    <w:abstractNumId w:val="5"/>
-  </w:num>
-  <w:num w:numId="9" w16cid:durableId="449206480">
+  <w:num w:numId="29" w16cid:durableId="773867138">
     <w:abstractNumId w:val="4"/>
-  </w:num>
-  <w:num w:numId="10" w16cid:durableId="1589541016">
-    <w:abstractNumId w:val="0"/>
-  </w:num>
-  <w:num w:numId="11" w16cid:durableId="1493259220">
-    <w:abstractNumId w:val="14"/>
-  </w:num>
-  <w:num w:numId="12" w16cid:durableId="1109355992">
-    <w:abstractNumId w:val="12"/>
-  </w:num>
-  <w:num w:numId="13" w16cid:durableId="634530465">
-    <w:abstractNumId w:val="6"/>
-  </w:num>
-  <w:num w:numId="14" w16cid:durableId="29503805">
-    <w:abstractNumId w:val="8"/>
-  </w:num>
-  <w:num w:numId="15" w16cid:durableId="110370365">
-    <w:abstractNumId w:val="9"/>
   </w:num>
 </w:numbering>
 </file>
@@ -5508,6 +7981,25 @@
       <w:contextualSpacing/>
     </w:pPr>
   </w:style>
+  <w:style w:type="table" w:styleId="TableGrid0">
+    <w:name w:val="Table Grid"/>
+    <w:basedOn w:val="TableNormal"/>
+    <w:uiPriority w:val="39"/>
+    <w:rsid w:val="00277C5F"/>
+    <w:pPr>
+      <w:spacing w:after="0" w:line="240" w:lineRule="auto"/>
+    </w:pPr>
+    <w:tblPr>
+      <w:tblBorders>
+        <w:top w:val="single" w:sz="4" w:space="0" w:color="auto"/>
+        <w:left w:val="single" w:sz="4" w:space="0" w:color="auto"/>
+        <w:bottom w:val="single" w:sz="4" w:space="0" w:color="auto"/>
+        <w:right w:val="single" w:sz="4" w:space="0" w:color="auto"/>
+        <w:insideH w:val="single" w:sz="4" w:space="0" w:color="auto"/>
+        <w:insideV w:val="single" w:sz="4" w:space="0" w:color="auto"/>
+      </w:tblBorders>
+    </w:tblPr>
+  </w:style>
 </w:styles>
 </file>
 

</xml_diff>